<commit_message>
Actualizar informe con figuras, TOC, listas APA 7 y anexos externos
- Portada real, tabla de contenido, lista de figuras (1-18) y lista de tablas (1-21)
- Figuras y diagramas incrustados en el informe (MD + DOCX)
- Anexos convertidos a descripcion + enlace anexos/<Anexo_X>/; Tablas 22-24 eliminadas
- Carpeta anexos/ con fuentes y capturas (62 evidencias Selenium)
</commit_message>
<xml_diff>
--- a/Informe_Final_ADSO_LexiSing.docx
+++ b/Informe_Final_ADSO_LexiSing.docx
@@ -215,21 +215,24 @@
         <w:pStyle w:val="Heading1"/>
       </w:pPr>
       <w:r>
-        <w:t>RESUMEN</w:t>
-      </w:r>
-    </w:p>
-    <w:p>
-      <w:r>
-        <w:rPr>
-          <w:b w:val="0"/>
-          <w:i w:val="0"/>
-        </w:rPr>
-        <w:t>El presente informe documenta el desarrollo de LexiSing, una plataforma web de comunicación inclusiva diseñada para facilitar la interacción entre personas sordas o mudas y usuarios oyentes mediante el reconocimiento de Lengua de Señas Colombiana (LSC) en tiempo real. El sistema integra tecnologías de vanguardia como MediaPipe HandLandmarker para la detección de gestos manuales, inteligencia artificial mediante Groq API para la formalización de texto, y una arquitectura basada en Angular 20, Django REST Framework y Firebase Firestore para garantizar comunicaciones en tiempo real. LexiSing reconoce 33 señas de palabras, 27 letras del abecedario dactilológico LSC y léxico empresarial, permitiendo a las personas sordas comunicarse de manera fluida en entornos laborales y educativos. El proyecto fue desarrollado bajo la metodología Scrum en cuatro sprints, cumpliendo con los objetivos planteados de inclusión social, accesibilidad digital y transformación tecnológica con enfoque humano.</w:t>
-      </w:r>
-    </w:p>
-    <w:p>
-      <w:r>
-        <w:br w:type="page"/>
+        <w:t>TABLA DE CONTENIDO</w:t>
+      </w:r>
+    </w:p>
+    <w:p>
+      <w:r>
+        <w:fldChar w:fldCharType="begin"/>
+      </w:r>
+      <w:r>
+        <w:instrText xml:space="preserve"> TOC \o "1-3" \h \z \u </w:instrText>
+      </w:r>
+      <w:r>
+        <w:fldChar w:fldCharType="separate"/>
+      </w:r>
+      <w:r>
+        <w:t xml:space="preserve">Haga clic aquí y presione F9 (o actualice el campo) para generar la tabla de contenido.</w:t>
+      </w:r>
+      <w:r>
+        <w:fldChar w:fldCharType="end"/>
       </w:r>
     </w:p>
     <w:p>
@@ -237,21 +240,205 @@
         <w:pStyle w:val="Heading1"/>
       </w:pPr>
       <w:r>
-        <w:t>ABSTRACT</w:t>
-      </w:r>
-    </w:p>
-    <w:p>
-      <w:r>
-        <w:rPr>
-          <w:b w:val="0"/>
-          <w:i w:val="0"/>
-        </w:rPr>
-        <w:t>This document presents the development of LexiSing, an inclusive web platform designed to facilitate communication between deaf or mute individuals and hearing users through real-time Colombian Sign Language (LSC) recognition. The system integrates cutting-edge technologies such as MediaPipe HandLandmarker for hand gesture detection, artificial intelligence via Groq API for text formalization, and an architecture based on Angular 20, Django REST Framework, and Firebase Firestore for real-time communications. LexiSing recognizes 33 word signs, 27 letters of the LSC dactylologic alphabet, and enterprise vocabulary, enabling deaf individuals to communicate fluidly in work and educational environments. The project was developed under the Scrum methodology in four sprints, meeting the established objectives of social inclusion, digital accessibility, and human-centered technological transformation.</w:t>
-      </w:r>
-    </w:p>
-    <w:p>
-      <w:r>
-        <w:br w:type="page"/>
+        <w:t>LISTA DE FIGURAS</w:t>
+      </w:r>
+    </w:p>
+    <w:p>
+      <w:r>
+        <w:rPr>
+          <w:b/>
+        </w:rPr>
+        <w:t>Figura 1.</w:t>
+      </w:r>
+      <w:r>
+        <w:t xml:space="preserve">  Diagrama de casos de uso del sistema.</w:t>
+      </w:r>
+    </w:p>
+    <w:p>
+      <w:r>
+        <w:rPr>
+          <w:b/>
+        </w:rPr>
+        <w:t>Figura 2.</w:t>
+      </w:r>
+      <w:r>
+        <w:t xml:space="preserve">  Arquitectura del sistema.</w:t>
+      </w:r>
+    </w:p>
+    <w:p>
+      <w:r>
+        <w:rPr>
+          <w:b/>
+        </w:rPr>
+        <w:t>Figura 3.</w:t>
+      </w:r>
+      <w:r>
+        <w:t xml:space="preserve">  Diagrama de componentes.</w:t>
+      </w:r>
+    </w:p>
+    <w:p>
+      <w:r>
+        <w:rPr>
+          <w:b/>
+        </w:rPr>
+        <w:t>Figura 4.</w:t>
+      </w:r>
+      <w:r>
+        <w:t xml:space="preserve">  Modelo entidad-relación de Firestore.</w:t>
+      </w:r>
+    </w:p>
+    <w:p>
+      <w:r>
+        <w:rPr>
+          <w:b/>
+        </w:rPr>
+        <w:t>Figura 5.</w:t>
+      </w:r>
+      <w:r>
+        <w:t xml:space="preserve">  Vista de inicio de sesión.</w:t>
+      </w:r>
+    </w:p>
+    <w:p>
+      <w:r>
+        <w:rPr>
+          <w:b/>
+        </w:rPr>
+        <w:t>Figura 6.</w:t>
+      </w:r>
+      <w:r>
+        <w:t xml:space="preserve">  Formulario de registro de usuario.</w:t>
+      </w:r>
+    </w:p>
+    <w:p>
+      <w:r>
+        <w:rPr>
+          <w:b/>
+        </w:rPr>
+        <w:t>Figura 7.</w:t>
+      </w:r>
+      <w:r>
+        <w:t xml:space="preserve">  Panel de administración con estadísticas.</w:t>
+      </w:r>
+    </w:p>
+    <w:p>
+      <w:r>
+        <w:rPr>
+          <w:b/>
+        </w:rPr>
+        <w:t>Figura 8.</w:t>
+      </w:r>
+      <w:r>
+        <w:t xml:space="preserve">  Lista de conversaciones con indicador de presencia.</w:t>
+      </w:r>
+    </w:p>
+    <w:p>
+      <w:r>
+        <w:rPr>
+          <w:b/>
+        </w:rPr>
+        <w:t>Figura 9.</w:t>
+      </w:r>
+      <w:r>
+        <w:t xml:space="preserve">  Vista de chat con cámara activa.</w:t>
+      </w:r>
+    </w:p>
+    <w:p>
+      <w:r>
+        <w:rPr>
+          <w:b/>
+        </w:rPr>
+        <w:t>Figura 10.</w:t>
+      </w:r>
+      <w:r>
+        <w:t xml:space="preserve">  Monitoreo de conversaciones del supervisor.</w:t>
+      </w:r>
+    </w:p>
+    <w:p>
+      <w:r>
+        <w:rPr>
+          <w:b/>
+        </w:rPr>
+        <w:t>Figura 11.</w:t>
+      </w:r>
+      <w:r>
+        <w:t xml:space="preserve">  Panel de gestión de usuarios.</w:t>
+      </w:r>
+    </w:p>
+    <w:p>
+      <w:r>
+        <w:rPr>
+          <w:b/>
+        </w:rPr>
+        <w:t>Figura 12.</w:t>
+      </w:r>
+      <w:r>
+        <w:t xml:space="preserve">  Configuración de perfil de usuario.</w:t>
+      </w:r>
+    </w:p>
+    <w:p>
+      <w:r>
+        <w:rPr>
+          <w:b/>
+        </w:rPr>
+        <w:t>Figura 13.</w:t>
+      </w:r>
+      <w:r>
+        <w:t xml:space="preserve">  Flujo de navegación del sistema.</w:t>
+      </w:r>
+    </w:p>
+    <w:p>
+      <w:r>
+        <w:rPr>
+          <w:b/>
+        </w:rPr>
+        <w:t>Figura 14.</w:t>
+      </w:r>
+      <w:r>
+        <w:t xml:space="preserve">  Evidencia de ejecución — Botones de autenticación social.</w:t>
+      </w:r>
+    </w:p>
+    <w:p>
+      <w:r>
+        <w:rPr>
+          <w:b/>
+        </w:rPr>
+        <w:t>Figura 15.</w:t>
+      </w:r>
+      <w:r>
+        <w:t xml:space="preserve">  Evidencia de ejecución — Flujo de autenticación con Microsoft.</w:t>
+      </w:r>
+    </w:p>
+    <w:p>
+      <w:r>
+        <w:rPr>
+          <w:b/>
+        </w:rPr>
+        <w:t>Figura 16.</w:t>
+      </w:r>
+      <w:r>
+        <w:t xml:space="preserve">  Arquitectura de despliegue en desarrollo local.</w:t>
+      </w:r>
+    </w:p>
+    <w:p>
+      <w:r>
+        <w:rPr>
+          <w:b/>
+        </w:rPr>
+        <w:t>Figura 17.</w:t>
+      </w:r>
+      <w:r>
+        <w:t xml:space="preserve">  Evidencia de funcionamiento — Dashboard del rol supervisor.</w:t>
+      </w:r>
+    </w:p>
+    <w:p>
+      <w:r>
+        <w:rPr>
+          <w:b/>
+        </w:rPr>
+        <w:t>Figura 18.</w:t>
+      </w:r>
+      <w:r>
+        <w:t xml:space="preserve">  Evidencia de funcionamiento — Reporte de mensajes por hora.</w:t>
       </w:r>
     </w:p>
     <w:p>
@@ -259,21 +446,238 @@
         <w:pStyle w:val="Heading1"/>
       </w:pPr>
       <w:r>
-        <w:t>PALABRAS CLAVE</w:t>
-      </w:r>
-    </w:p>
-    <w:p>
-      <w:r>
-        <w:rPr>
-          <w:b w:val="0"/>
-          <w:i w:val="0"/>
-        </w:rPr>
-        <w:t>Reconocimiento de señas, Comunicación inclusiva, Inteligencia artificial, Lengua de Señas Colombiana, Accesibilidad digital.</w:t>
-      </w:r>
-    </w:p>
-    <w:p>
-      <w:r>
-        <w:br w:type="page"/>
+        <w:t>LISTA DE TABLAS</w:t>
+      </w:r>
+    </w:p>
+    <w:p>
+      <w:r>
+        <w:rPr>
+          <w:b/>
+        </w:rPr>
+        <w:t>Tabla 1.</w:t>
+      </w:r>
+      <w:r>
+        <w:t xml:space="preserve">  Actores del sistema.</w:t>
+      </w:r>
+    </w:p>
+    <w:p>
+      <w:r>
+        <w:rPr>
+          <w:b/>
+        </w:rPr>
+        <w:t>Tabla 2.</w:t>
+      </w:r>
+      <w:r>
+        <w:t xml:space="preserve">  Requerimientos funcionales.</w:t>
+      </w:r>
+    </w:p>
+    <w:p>
+      <w:r>
+        <w:rPr>
+          <w:b/>
+        </w:rPr>
+        <w:t>Tabla 3.</w:t>
+      </w:r>
+      <w:r>
+        <w:t xml:space="preserve">  Requerimientos no funcionales.</w:t>
+      </w:r>
+    </w:p>
+    <w:p>
+      <w:r>
+        <w:rPr>
+          <w:b/>
+        </w:rPr>
+        <w:t>Tabla 4.</w:t>
+      </w:r>
+      <w:r>
+        <w:t xml:space="preserve">  Historias de usuario.</w:t>
+      </w:r>
+    </w:p>
+    <w:p>
+      <w:r>
+        <w:rPr>
+          <w:b/>
+        </w:rPr>
+        <w:t>Tabla 5.</w:t>
+      </w:r>
+      <w:r>
+        <w:t xml:space="preserve">  Product Backlog priorizado.</w:t>
+      </w:r>
+    </w:p>
+    <w:p>
+      <w:r>
+        <w:rPr>
+          <w:b/>
+        </w:rPr>
+        <w:t>Tabla 6.</w:t>
+      </w:r>
+      <w:r>
+        <w:t xml:space="preserve">  Funcionalidades del MVP.</w:t>
+      </w:r>
+    </w:p>
+    <w:p>
+      <w:r>
+        <w:rPr>
+          <w:b/>
+        </w:rPr>
+        <w:t>Tabla 7.</w:t>
+      </w:r>
+      <w:r>
+        <w:t xml:space="preserve">  Colección «usuarios» de Firestore.</w:t>
+      </w:r>
+    </w:p>
+    <w:p>
+      <w:r>
+        <w:rPr>
+          <w:b/>
+        </w:rPr>
+        <w:t>Tabla 8.</w:t>
+      </w:r>
+      <w:r>
+        <w:t xml:space="preserve">  Colección «conversaciones» de Firestore.</w:t>
+      </w:r>
+    </w:p>
+    <w:p>
+      <w:r>
+        <w:rPr>
+          <w:b/>
+        </w:rPr>
+        <w:t>Tabla 9.</w:t>
+      </w:r>
+      <w:r>
+        <w:t xml:space="preserve">  Subcolección «mensajes» de Firestore.</w:t>
+      </w:r>
+    </w:p>
+    <w:p>
+      <w:r>
+        <w:rPr>
+          <w:b/>
+        </w:rPr>
+        <w:t>Tabla 10.</w:t>
+      </w:r>
+      <w:r>
+        <w:t xml:space="preserve">  Colección «activities» de Firestore.</w:t>
+      </w:r>
+    </w:p>
+    <w:p>
+      <w:r>
+        <w:rPr>
+          <w:b/>
+        </w:rPr>
+        <w:t>Tabla 11.</w:t>
+      </w:r>
+      <w:r>
+        <w:t xml:space="preserve">  Requisitos previos del entorno.</w:t>
+      </w:r>
+    </w:p>
+    <w:p>
+      <w:r>
+        <w:rPr>
+          <w:b/>
+        </w:rPr>
+        <w:t>Tabla 12.</w:t>
+      </w:r>
+      <w:r>
+        <w:t xml:space="preserve">  Endpoints del backend Django REST Framework.</w:t>
+      </w:r>
+    </w:p>
+    <w:p>
+      <w:r>
+        <w:rPr>
+          <w:b/>
+        </w:rPr>
+        <w:t>Tabla 13.</w:t>
+      </w:r>
+      <w:r>
+        <w:t xml:space="preserve">  Servicios frontend Angular.</w:t>
+      </w:r>
+    </w:p>
+    <w:p>
+      <w:r>
+        <w:rPr>
+          <w:b/>
+        </w:rPr>
+        <w:t>Tabla 14.</w:t>
+      </w:r>
+      <w:r>
+        <w:t xml:space="preserve">  Plan de pruebas del sistema.</w:t>
+      </w:r>
+    </w:p>
+    <w:p>
+      <w:r>
+        <w:rPr>
+          <w:b/>
+        </w:rPr>
+        <w:t>Tabla 15.</w:t>
+      </w:r>
+      <w:r>
+        <w:t xml:space="preserve">  Casos de prueba del sistema.</w:t>
+      </w:r>
+    </w:p>
+    <w:p>
+      <w:r>
+        <w:rPr>
+          <w:b/>
+        </w:rPr>
+        <w:t>Tabla 16.</w:t>
+      </w:r>
+      <w:r>
+        <w:t xml:space="preserve">  Incidencias encontradas durante el desarrollo.</w:t>
+      </w:r>
+    </w:p>
+    <w:p>
+      <w:r>
+        <w:rPr>
+          <w:b/>
+        </w:rPr>
+        <w:t>Tabla 17.</w:t>
+      </w:r>
+      <w:r>
+        <w:t xml:space="preserve">  Servicios utilizados en el proyecto.</w:t>
+      </w:r>
+    </w:p>
+    <w:p>
+      <w:r>
+        <w:rPr>
+          <w:b/>
+        </w:rPr>
+        <w:t>Tabla 18.</w:t>
+      </w:r>
+      <w:r>
+        <w:t xml:space="preserve">  Estimación de costos del proyecto.</w:t>
+      </w:r>
+    </w:p>
+    <w:p>
+      <w:r>
+        <w:rPr>
+          <w:b/>
+        </w:rPr>
+        <w:t>Tabla 19.</w:t>
+      </w:r>
+      <w:r>
+        <w:t xml:space="preserve">  Costos operativos mensuales.</w:t>
+      </w:r>
+    </w:p>
+    <w:p>
+      <w:r>
+        <w:rPr>
+          <w:b/>
+        </w:rPr>
+        <w:t>Tabla 20.</w:t>
+      </w:r>
+      <w:r>
+        <w:t xml:space="preserve">  Cumplimiento de los objetivos.</w:t>
+      </w:r>
+    </w:p>
+    <w:p>
+      <w:r>
+        <w:rPr>
+          <w:b/>
+        </w:rPr>
+        <w:t>Tabla 21.</w:t>
+      </w:r>
+      <w:r>
+        <w:t xml:space="preserve">  Funcionalidades implementadas.</w:t>
       </w:r>
     </w:p>
     <w:p>
@@ -281,6 +685,72 @@
         <w:pStyle w:val="Heading1"/>
       </w:pPr>
       <w:r>
+        <w:t>RESUMEN</w:t>
+      </w:r>
+    </w:p>
+    <w:p>
+      <w:r>
+        <w:rPr>
+          <w:b w:val="0"/>
+          <w:i w:val="0"/>
+        </w:rPr>
+        <w:t>El presente informe documenta el desarrollo de LexiSing, una plataforma web de comunicación inclusiva diseñada para facilitar la interacción entre personas sordas o mudas y usuarios oyentes mediante el reconocimiento de Lengua de Señas Colombiana (LSC) en tiempo real. El sistema integra tecnologías de vanguardia como MediaPipe HandLandmarker para la detección de gestos manuales, inteligencia artificial mediante Groq API para la formalización de texto, y una arquitectura basada en Angular 20, Django REST Framework y Firebase Firestore para garantizar comunicaciones en tiempo real. LexiSing reconoce 33 señas de palabras, 27 letras del abecedario dactilológico LSC y léxico empresarial, permitiendo a las personas sordas comunicarse de manera fluida en entornos laborales y educativos. El proyecto fue desarrollado bajo la metodología Scrum en cuatro sprints, cumpliendo con los objetivos planteados de inclusión social, accesibilidad digital y transformación tecnológica con enfoque humano.</w:t>
+      </w:r>
+    </w:p>
+    <w:p>
+      <w:r>
+        <w:br w:type="page"/>
+      </w:r>
+    </w:p>
+    <w:p>
+      <w:pPr>
+        <w:pStyle w:val="Heading1"/>
+      </w:pPr>
+      <w:r>
+        <w:t>ABSTRACT</w:t>
+      </w:r>
+    </w:p>
+    <w:p>
+      <w:r>
+        <w:rPr>
+          <w:b w:val="0"/>
+          <w:i w:val="0"/>
+        </w:rPr>
+        <w:t>This document presents the development of LexiSing, an inclusive web platform designed to facilitate communication between deaf or mute individuals and hearing users through real-time Colombian Sign Language (LSC) recognition. The system integrates cutting-edge technologies such as MediaPipe HandLandmarker for hand gesture detection, artificial intelligence via Groq API for text formalization, and an architecture based on Angular 20, Django REST Framework, and Firebase Firestore for real-time communications. LexiSing recognizes 33 word signs, 27 letters of the LSC dactylologic alphabet, and enterprise vocabulary, enabling deaf individuals to communicate fluidly in work and educational environments. The project was developed under the Scrum methodology in four sprints, meeting the established objectives of social inclusion, digital accessibility, and human-centered technological transformation.</w:t>
+      </w:r>
+    </w:p>
+    <w:p>
+      <w:r>
+        <w:br w:type="page"/>
+      </w:r>
+    </w:p>
+    <w:p>
+      <w:pPr>
+        <w:pStyle w:val="Heading1"/>
+      </w:pPr>
+      <w:r>
+        <w:t>PALABRAS CLAVE</w:t>
+      </w:r>
+    </w:p>
+    <w:p>
+      <w:r>
+        <w:rPr>
+          <w:b w:val="0"/>
+          <w:i w:val="0"/>
+        </w:rPr>
+        <w:t>Reconocimiento de señas, Comunicación inclusiva, Inteligencia artificial, Lengua de Señas Colombiana, Accesibilidad digital.</w:t>
+      </w:r>
+    </w:p>
+    <w:p>
+      <w:r>
+        <w:br w:type="page"/>
+      </w:r>
+    </w:p>
+    <w:p>
+      <w:pPr>
+        <w:pStyle w:val="Heading1"/>
+      </w:pPr>
+      <w:r>
         <w:t>1. INTRODUCCIÓN</w:t>
       </w:r>
     </w:p>
@@ -1045,6 +1515,29 @@
       </w:pPr>
       <w:r>
         <w:t>5.1 Actores</w:t>
+      </w:r>
+    </w:p>
+    <w:p>
+      <w:r>
+        <w:rPr>
+          <w:sz w:val="24"/>
+        </w:rPr>
+        <w:t>Los actores del sistema se detallan en la Tabla 1 (Actores del sistema).</w:t>
+      </w:r>
+    </w:p>
+    <w:p>
+      <w:r>
+        <w:rPr>
+          <w:b/>
+          <w:sz w:val="24"/>
+        </w:rPr>
+        <w:t>Tabla 1.</w:t>
+      </w:r>
+      <w:r>
+        <w:rPr>
+          <w:sz w:val="24"/>
+        </w:rPr>
+        <w:t xml:space="preserve"> Actores del sistema</w:t>
       </w:r>
     </w:p>
     <w:tbl>
@@ -1316,6 +1809,29 @@
       </w:pPr>
       <w:r>
         <w:t>5.2 Requerimientos Funcionales</w:t>
+      </w:r>
+    </w:p>
+    <w:p>
+      <w:r>
+        <w:rPr>
+          <w:sz w:val="24"/>
+        </w:rPr>
+        <w:t>Los requerimientos funcionales se detallan en la Tabla 2 (Requerimientos funcionales).</w:t>
+      </w:r>
+    </w:p>
+    <w:p>
+      <w:r>
+        <w:rPr>
+          <w:b/>
+          <w:sz w:val="24"/>
+        </w:rPr>
+        <w:t>Tabla 2.</w:t>
+      </w:r>
+      <w:r>
+        <w:rPr>
+          <w:sz w:val="24"/>
+        </w:rPr>
+        <w:t xml:space="preserve"> Requerimientos funcionales</w:t>
       </w:r>
     </w:p>
     <w:tbl>
@@ -2047,6 +2563,29 @@
         <w:t>5.3 Requerimientos No Funcionales</w:t>
       </w:r>
     </w:p>
+    <w:p>
+      <w:r>
+        <w:rPr>
+          <w:sz w:val="24"/>
+        </w:rPr>
+        <w:t>Los requerimientos no funcionales se detallan en la Tabla 3 (Requerimientos no funcionales).</w:t>
+      </w:r>
+    </w:p>
+    <w:p>
+      <w:r>
+        <w:rPr>
+          <w:b/>
+          <w:sz w:val="24"/>
+        </w:rPr>
+        <w:t>Tabla 3.</w:t>
+      </w:r>
+      <w:r>
+        <w:rPr>
+          <w:sz w:val="24"/>
+        </w:rPr>
+        <w:t xml:space="preserve"> Requerimientos no funcionales</w:t>
+      </w:r>
+    </w:p>
     <w:tbl>
       <w:tblPr>
         <w:tblStyle w:val="TableGrid"/>
@@ -3112,11 +3651,89 @@
     </w:p>
     <w:p/>
     <w:p>
+      <w:r>
+        <w:t>El diagrama de casos de uso consolida los flujos anteriores:</w:t>
+      </w:r>
+    </w:p>
+    <w:p>
+      <w:pPr>
+        <w:jc w:val="center"/>
+      </w:pPr>
+      <w:r>
+        <w:drawing>
+          <wp:inline xmlns:a="http://schemas.openxmlformats.org/drawingml/2006/main" xmlns:pic="http://schemas.openxmlformats.org/drawingml/2006/picture">
+            <wp:extent cx="5029200" cy="7112401"/>
+            <wp:docPr id="1" name="Picture 1"/>
+            <wp:cNvGraphicFramePr>
+              <a:graphicFrameLocks noChangeAspect="1"/>
+            </wp:cNvGraphicFramePr>
+            <a:graphic>
+              <a:graphicData uri="http://schemas.openxmlformats.org/drawingml/2006/picture">
+                <pic:pic>
+                  <pic:nvPicPr>
+                    <pic:cNvPr id="0" name="casos-de-uso.png"/>
+                    <pic:cNvPicPr/>
+                  </pic:nvPicPr>
+                  <pic:blipFill>
+                    <a:blip r:embed="rId9"/>
+                    <a:stretch>
+                      <a:fillRect/>
+                    </a:stretch>
+                  </pic:blipFill>
+                  <pic:spPr>
+                    <a:xfrm>
+                      <a:off x="0" y="0"/>
+                      <a:ext cx="5029200" cy="7112401"/>
+                    </a:xfrm>
+                    <a:prstGeom prst="rect"/>
+                  </pic:spPr>
+                </pic:pic>
+              </a:graphicData>
+            </a:graphic>
+          </wp:inline>
+        </w:drawing>
+      </w:r>
+    </w:p>
+    <w:p>
+      <w:r>
+        <w:rPr>
+          <w:b/>
+        </w:rPr>
+        <w:t>Figura 1.</w:t>
+      </w:r>
+      <w:r>
+        <w:t xml:space="preserve"> Diagrama de casos de uso del sistema.</w:t>
+      </w:r>
+    </w:p>
+    <w:p>
       <w:pPr>
         <w:pStyle w:val="Heading2"/>
       </w:pPr>
       <w:r>
         <w:t>5.5 Historias de Usuario</w:t>
+      </w:r>
+    </w:p>
+    <w:p>
+      <w:r>
+        <w:rPr>
+          <w:sz w:val="24"/>
+        </w:rPr>
+        <w:t>Las historias de usuario se detallan en la Tabla 4 (Historias de usuario).</w:t>
+      </w:r>
+    </w:p>
+    <w:p>
+      <w:r>
+        <w:rPr>
+          <w:b/>
+          <w:sz w:val="24"/>
+        </w:rPr>
+        <w:t>Tabla 4.</w:t>
+      </w:r>
+      <w:r>
+        <w:rPr>
+          <w:sz w:val="24"/>
+        </w:rPr>
+        <w:t xml:space="preserve"> Historias de usuario</w:t>
       </w:r>
     </w:p>
     <w:tbl>
@@ -3672,6 +4289,29 @@
       </w:pPr>
       <w:r>
         <w:t>5.6 Product Backlog</w:t>
+      </w:r>
+    </w:p>
+    <w:p>
+      <w:r>
+        <w:rPr>
+          <w:sz w:val="24"/>
+        </w:rPr>
+        <w:t>El Product Backlog se detalla en la Tabla 5 (Product Backlog priorizado).</w:t>
+      </w:r>
+    </w:p>
+    <w:p>
+      <w:r>
+        <w:rPr>
+          <w:b/>
+          <w:sz w:val="24"/>
+        </w:rPr>
+        <w:t>Tabla 5.</w:t>
+      </w:r>
+      <w:r>
+        <w:rPr>
+          <w:sz w:val="24"/>
+        </w:rPr>
+        <w:t xml:space="preserve"> Product Backlog priorizado</w:t>
       </w:r>
     </w:p>
     <w:tbl>
@@ -4628,6 +5268,29 @@
         <w:t>El MVP (Producto Mínimo Viable) de LexiSing está enfocado en validar la experiencia principal del usuario: permitir una comunicación básica entre una persona sorda y un empleado mediante traducción de señas y texto.</w:t>
       </w:r>
     </w:p>
+    <w:p>
+      <w:r>
+        <w:rPr>
+          <w:sz w:val="24"/>
+        </w:rPr>
+        <w:t>Las funcionalidades del MVP se detallan en la Tabla 6 (Funcionalidades del MVP).</w:t>
+      </w:r>
+    </w:p>
+    <w:p>
+      <w:r>
+        <w:rPr>
+          <w:b/>
+          <w:sz w:val="24"/>
+        </w:rPr>
+        <w:t>Tabla 6.</w:t>
+      </w:r>
+      <w:r>
+        <w:rPr>
+          <w:sz w:val="24"/>
+        </w:rPr>
+        <w:t xml:space="preserve"> Funcionalidades del MVP</w:t>
+      </w:r>
+    </w:p>
     <w:tbl>
       <w:tblPr>
         <w:tblStyle w:val="TableGrid"/>
@@ -5113,6 +5776,61 @@
       </w:r>
     </w:p>
     <w:p>
+      <w:r>
+        <w:t>La Figura 2 ilustra la arquitectura de tres capas del sistema:</w:t>
+      </w:r>
+    </w:p>
+    <w:p>
+      <w:pPr>
+        <w:jc w:val="center"/>
+      </w:pPr>
+      <w:r>
+        <w:drawing>
+          <wp:inline xmlns:a="http://schemas.openxmlformats.org/drawingml/2006/main" xmlns:pic="http://schemas.openxmlformats.org/drawingml/2006/picture">
+            <wp:extent cx="5029200" cy="3030842"/>
+            <wp:docPr id="2" name="Picture 2"/>
+            <wp:cNvGraphicFramePr>
+              <a:graphicFrameLocks noChangeAspect="1"/>
+            </wp:cNvGraphicFramePr>
+            <a:graphic>
+              <a:graphicData uri="http://schemas.openxmlformats.org/drawingml/2006/picture">
+                <pic:pic>
+                  <pic:nvPicPr>
+                    <pic:cNvPr id="0" name="arquitectura-sistema.png"/>
+                    <pic:cNvPicPr/>
+                  </pic:nvPicPr>
+                  <pic:blipFill>
+                    <a:blip r:embed="rId10"/>
+                    <a:stretch>
+                      <a:fillRect/>
+                    </a:stretch>
+                  </pic:blipFill>
+                  <pic:spPr>
+                    <a:xfrm>
+                      <a:off x="0" y="0"/>
+                      <a:ext cx="5029200" cy="3030842"/>
+                    </a:xfrm>
+                    <a:prstGeom prst="rect"/>
+                  </pic:spPr>
+                </pic:pic>
+              </a:graphicData>
+            </a:graphic>
+          </wp:inline>
+        </w:drawing>
+      </w:r>
+    </w:p>
+    <w:p>
+      <w:r>
+        <w:rPr>
+          <w:b/>
+        </w:rPr>
+        <w:t>Figura 2.</w:t>
+      </w:r>
+      <w:r>
+        <w:t xml:space="preserve"> Arquitectura del sistema.</w:t>
+      </w:r>
+    </w:p>
+    <w:p>
       <w:pPr>
         <w:pStyle w:val="Heading2"/>
       </w:pPr>
@@ -5122,11 +5840,92 @@
     </w:p>
     <w:p>
       <w:r>
-        <w:rPr>
-          <w:i/>
-          <w:color w:val="808080"/>
-        </w:rPr>
-        <w:t>(Incluir diagrama de componentes del sistema mostrando las capas Frontend, Backend y Servicios Cloud)</w:t>
+        <w:t>La Figura 3 muestra los componentes del sistema, sus servicios transversales y las conexiones con los servicios externos (Firebase y Groq API) y el backend:</w:t>
+      </w:r>
+    </w:p>
+    <w:p>
+      <w:pPr>
+        <w:jc w:val="center"/>
+      </w:pPr>
+      <w:r>
+        <w:drawing>
+          <wp:inline xmlns:a="http://schemas.openxmlformats.org/drawingml/2006/main" xmlns:pic="http://schemas.openxmlformats.org/drawingml/2006/picture">
+            <wp:extent cx="5029200" cy="2351640"/>
+            <wp:docPr id="3" name="Picture 3"/>
+            <wp:cNvGraphicFramePr>
+              <a:graphicFrameLocks noChangeAspect="1"/>
+            </wp:cNvGraphicFramePr>
+            <a:graphic>
+              <a:graphicData uri="http://schemas.openxmlformats.org/drawingml/2006/picture">
+                <pic:pic>
+                  <pic:nvPicPr>
+                    <pic:cNvPr id="0" name="diagrama-componentes.png"/>
+                    <pic:cNvPicPr/>
+                  </pic:nvPicPr>
+                  <pic:blipFill>
+                    <a:blip r:embed="rId11"/>
+                    <a:stretch>
+                      <a:fillRect/>
+                    </a:stretch>
+                  </pic:blipFill>
+                  <pic:spPr>
+                    <a:xfrm>
+                      <a:off x="0" y="0"/>
+                      <a:ext cx="5029200" cy="2351640"/>
+                    </a:xfrm>
+                    <a:prstGeom prst="rect"/>
+                  </pic:spPr>
+                </pic:pic>
+              </a:graphicData>
+            </a:graphic>
+          </wp:inline>
+        </w:drawing>
+      </w:r>
+    </w:p>
+    <w:p>
+      <w:r>
+        <w:rPr>
+          <w:b/>
+        </w:rPr>
+        <w:t>Figura 3.</w:t>
+      </w:r>
+      <w:r>
+        <w:t xml:space="preserve"> Diagrama de componentes.</w:t>
+      </w:r>
+    </w:p>
+    <w:p>
+      <w:r>
+        <w:t xml:space="preserve">Se destaca el flujo de formalización de texto: el </w:t>
+      </w:r>
+      <w:r>
+        <w:rPr>
+          <w:rFonts w:ascii="Courier New" w:hAnsi="Courier New"/>
+          <w:sz w:val="20"/>
+        </w:rPr>
+        <w:t>TextFormalizer</w:t>
+      </w:r>
+      <w:r>
+        <w:t xml:space="preserve"> en el frontend envía las glosas detectadas al endpoint </w:t>
+      </w:r>
+      <w:r>
+        <w:rPr>
+          <w:rFonts w:ascii="Courier New" w:hAnsi="Courier New"/>
+          <w:sz w:val="20"/>
+        </w:rPr>
+        <w:t>POST /api/text/formalize/</w:t>
+      </w:r>
+      <w:r>
+        <w:t xml:space="preserve"> del backend (Django DRF), que a través del </w:t>
+      </w:r>
+      <w:r>
+        <w:rPr>
+          <w:rFonts w:ascii="Courier New" w:hAnsi="Courier New"/>
+          <w:sz w:val="20"/>
+        </w:rPr>
+        <w:t>GroqService</w:t>
+      </w:r>
+      <w:r>
+        <w:t xml:space="preserve"> consulta la Groq API y devuelve el texto formal al chat.</w:t>
       </w:r>
     </w:p>
     <w:p/>
@@ -5149,11 +5948,89 @@
     </w:p>
     <w:p>
       <w:r>
+        <w:t>A continuación se describe la estructura de colecciones y documentos (ver Figura 4):</w:t>
+      </w:r>
+    </w:p>
+    <w:p>
+      <w:pPr>
+        <w:jc w:val="center"/>
+      </w:pPr>
+      <w:r>
+        <w:drawing>
+          <wp:inline xmlns:a="http://schemas.openxmlformats.org/drawingml/2006/main" xmlns:pic="http://schemas.openxmlformats.org/drawingml/2006/picture">
+            <wp:extent cx="5029200" cy="3172128"/>
+            <wp:docPr id="4" name="Picture 4"/>
+            <wp:cNvGraphicFramePr>
+              <a:graphicFrameLocks noChangeAspect="1"/>
+            </wp:cNvGraphicFramePr>
+            <a:graphic>
+              <a:graphicData uri="http://schemas.openxmlformats.org/drawingml/2006/picture">
+                <pic:pic>
+                  <pic:nvPicPr>
+                    <pic:cNvPr id="0" name="modelo-entidad-relacion.png"/>
+                    <pic:cNvPicPr/>
+                  </pic:nvPicPr>
+                  <pic:blipFill>
+                    <a:blip r:embed="rId12"/>
+                    <a:stretch>
+                      <a:fillRect/>
+                    </a:stretch>
+                  </pic:blipFill>
+                  <pic:spPr>
+                    <a:xfrm>
+                      <a:off x="0" y="0"/>
+                      <a:ext cx="5029200" cy="3172128"/>
+                    </a:xfrm>
+                    <a:prstGeom prst="rect"/>
+                  </pic:spPr>
+                </pic:pic>
+              </a:graphicData>
+            </a:graphic>
+          </wp:inline>
+        </w:drawing>
+      </w:r>
+    </w:p>
+    <w:p>
+      <w:r>
+        <w:rPr>
+          <w:b/>
+        </w:rPr>
+        <w:t>Figura 4.</w:t>
+      </w:r>
+      <w:r>
+        <w:t xml:space="preserve"> Modelo entidad-relación de Firestore.</w:t>
+      </w:r>
+    </w:p>
+    <w:p>
+      <w:r>
         <w:rPr>
           <w:b/>
           <w:i w:val="0"/>
         </w:rPr>
         <w:t>Colección: usuarios</w:t>
+      </w:r>
+    </w:p>
+    <w:p>
+      <w:r>
+        <w:rPr>
+          <w:sz w:val="24"/>
+        </w:rPr>
+        <w:t>La estructura de la colección «usuarios» se detalla en la Tabla 7 (Colección «usuarios» de Firestore).</w:t>
+      </w:r>
+    </w:p>
+    <w:p>
+      <w:r>
+        <w:rPr>
+          <w:b/>
+          <w:sz w:val="24"/>
+        </w:rPr>
+        <w:t>Tabla 7.</w:t>
+      </w:r>
+      <w:r>
+        <w:rPr>
+          <w:sz w:val="24"/>
+        </w:rPr>
+        <w:t xml:space="preserve"> Colección «usuarios» de Firestore</w:t>
       </w:r>
     </w:p>
     <w:tbl>
@@ -5616,6 +6493,29 @@
         <w:t>Colección: conversaciones</w:t>
       </w:r>
     </w:p>
+    <w:p>
+      <w:r>
+        <w:rPr>
+          <w:sz w:val="24"/>
+        </w:rPr>
+        <w:t>La estructura de la colección «conversaciones» se detalla en la Tabla 8 (Colección «conversaciones» de Firestore).</w:t>
+      </w:r>
+    </w:p>
+    <w:p>
+      <w:r>
+        <w:rPr>
+          <w:b/>
+          <w:sz w:val="24"/>
+        </w:rPr>
+        <w:t>Tabla 8.</w:t>
+      </w:r>
+      <w:r>
+        <w:rPr>
+          <w:sz w:val="24"/>
+        </w:rPr>
+        <w:t xml:space="preserve"> Colección «conversaciones» de Firestore</w:t>
+      </w:r>
+    </w:p>
     <w:tbl>
       <w:tblPr>
         <w:tblStyle w:val="TableGrid"/>
@@ -5860,6 +6760,29 @@
         <w:t>Subcolección: mensajes</w:t>
       </w:r>
     </w:p>
+    <w:p>
+      <w:r>
+        <w:rPr>
+          <w:sz w:val="24"/>
+        </w:rPr>
+        <w:t>La estructura de la subcolección «mensajes» se detalla en la Tabla 9 (Subcolección «mensajes» de Firestore).</w:t>
+      </w:r>
+    </w:p>
+    <w:p>
+      <w:r>
+        <w:rPr>
+          <w:b/>
+          <w:sz w:val="24"/>
+        </w:rPr>
+        <w:t>Tabla 9.</w:t>
+      </w:r>
+      <w:r>
+        <w:rPr>
+          <w:sz w:val="24"/>
+        </w:rPr>
+        <w:t xml:space="preserve"> Subcolección «mensajes» de Firestore</w:t>
+      </w:r>
+    </w:p>
     <w:tbl>
       <w:tblPr>
         <w:tblStyle w:val="TableGrid"/>
@@ -6266,6 +7189,29 @@
         <w:t>Colección: activities</w:t>
       </w:r>
     </w:p>
+    <w:p>
+      <w:r>
+        <w:rPr>
+          <w:sz w:val="24"/>
+        </w:rPr>
+        <w:t>La estructura de la colección «activities» se detalla en la Tabla 10 (Colección «activities» de Firestore).</w:t>
+      </w:r>
+    </w:p>
+    <w:p>
+      <w:r>
+        <w:rPr>
+          <w:b/>
+          <w:sz w:val="24"/>
+        </w:rPr>
+        <w:t>Tabla 10.</w:t>
+      </w:r>
+      <w:r>
+        <w:rPr>
+          <w:sz w:val="24"/>
+        </w:rPr>
+        <w:t xml:space="preserve"> Colección «activities» de Firestore</w:t>
+      </w:r>
+    </w:p>
     <w:tbl>
       <w:tblPr>
         <w:tblStyle w:val="TableGrid"/>
@@ -6582,11 +7528,421 @@
     </w:p>
     <w:p>
       <w:r>
-        <w:rPr>
-          <w:i/>
-          <w:color w:val="808080"/>
-        </w:rPr>
-        <w:t>(Incluir capturas de pantalla de las principales vistas del sistema: login, dashboard, chat con cámara, monitoreo, gestión de usuarios)</w:t>
+        <w:t xml:space="preserve">Los wireframes se evidencian con </w:t>
+      </w:r>
+      <w:r>
+        <w:rPr>
+          <w:b/>
+        </w:rPr>
+        <w:t>capturas reales de la aplicación funcionando en el navegador</w:t>
+      </w:r>
+      <w:r>
+        <w:t>, generadas por la suite Selenium (Anexo H). Las Figuras 5 a 12 muestran las vistas principales del sistema:</w:t>
+      </w:r>
+    </w:p>
+    <w:p>
+      <w:pPr>
+        <w:jc w:val="center"/>
+      </w:pPr>
+      <w:r>
+        <w:drawing>
+          <wp:inline xmlns:a="http://schemas.openxmlformats.org/drawingml/2006/main" xmlns:pic="http://schemas.openxmlformats.org/drawingml/2006/picture">
+            <wp:extent cx="5029200" cy="2816352"/>
+            <wp:docPr id="5" name="Picture 5"/>
+            <wp:cNvGraphicFramePr>
+              <a:graphicFrameLocks noChangeAspect="1"/>
+            </wp:cNvGraphicFramePr>
+            <a:graphic>
+              <a:graphicData uri="http://schemas.openxmlformats.org/drawingml/2006/picture">
+                <pic:pic>
+                  <pic:nvPicPr>
+                    <pic:cNvPr id="0" name="01-form-login-lleno.png"/>
+                    <pic:cNvPicPr/>
+                  </pic:nvPicPr>
+                  <pic:blipFill>
+                    <a:blip r:embed="rId13"/>
+                    <a:stretch>
+                      <a:fillRect/>
+                    </a:stretch>
+                  </pic:blipFill>
+                  <pic:spPr>
+                    <a:xfrm>
+                      <a:off x="0" y="0"/>
+                      <a:ext cx="5029200" cy="2816352"/>
+                    </a:xfrm>
+                    <a:prstGeom prst="rect"/>
+                  </pic:spPr>
+                </pic:pic>
+              </a:graphicData>
+            </a:graphic>
+          </wp:inline>
+        </w:drawing>
+      </w:r>
+    </w:p>
+    <w:p>
+      <w:r>
+        <w:rPr>
+          <w:b/>
+        </w:rPr>
+        <w:t>Figura 5.</w:t>
+      </w:r>
+      <w:r>
+        <w:t xml:space="preserve"> Vista de inicio de sesión (login) con opciones de correo, Google y Microsoft.</w:t>
+      </w:r>
+    </w:p>
+    <w:p>
+      <w:pPr>
+        <w:jc w:val="center"/>
+      </w:pPr>
+      <w:r>
+        <w:drawing>
+          <wp:inline xmlns:a="http://schemas.openxmlformats.org/drawingml/2006/main" xmlns:pic="http://schemas.openxmlformats.org/drawingml/2006/picture">
+            <wp:extent cx="5029200" cy="5575227"/>
+            <wp:docPr id="6" name="Picture 6"/>
+            <wp:cNvGraphicFramePr>
+              <a:graphicFrameLocks noChangeAspect="1"/>
+            </wp:cNvGraphicFramePr>
+            <a:graphic>
+              <a:graphicData uri="http://schemas.openxmlformats.org/drawingml/2006/picture">
+                <pic:pic>
+                  <pic:nvPicPr>
+                    <pic:cNvPr id="0" name="04-form-registro-lleno.png"/>
+                    <pic:cNvPicPr/>
+                  </pic:nvPicPr>
+                  <pic:blipFill>
+                    <a:blip r:embed="rId14"/>
+                    <a:stretch>
+                      <a:fillRect/>
+                    </a:stretch>
+                  </pic:blipFill>
+                  <pic:spPr>
+                    <a:xfrm>
+                      <a:off x="0" y="0"/>
+                      <a:ext cx="5029200" cy="5575227"/>
+                    </a:xfrm>
+                    <a:prstGeom prst="rect"/>
+                  </pic:spPr>
+                </pic:pic>
+              </a:graphicData>
+            </a:graphic>
+          </wp:inline>
+        </w:drawing>
+      </w:r>
+    </w:p>
+    <w:p>
+      <w:r>
+        <w:rPr>
+          <w:b/>
+        </w:rPr>
+        <w:t>Figura 6.</w:t>
+      </w:r>
+      <w:r>
+        <w:t xml:space="preserve"> Formulario de registro de usuario.</w:t>
+      </w:r>
+    </w:p>
+    <w:p>
+      <w:pPr>
+        <w:jc w:val="center"/>
+      </w:pPr>
+      <w:r>
+        <w:drawing>
+          <wp:inline xmlns:a="http://schemas.openxmlformats.org/drawingml/2006/main" xmlns:pic="http://schemas.openxmlformats.org/drawingml/2006/picture">
+            <wp:extent cx="5029200" cy="2773866"/>
+            <wp:docPr id="7" name="Picture 7"/>
+            <wp:cNvGraphicFramePr>
+              <a:graphicFrameLocks noChangeAspect="1"/>
+            </wp:cNvGraphicFramePr>
+            <a:graphic>
+              <a:graphicData uri="http://schemas.openxmlformats.org/drawingml/2006/picture">
+                <pic:pic>
+                  <pic:nvPicPr>
+                    <pic:cNvPr id="0" name="16-rol-admin-admin-dashboard.png"/>
+                    <pic:cNvPicPr/>
+                  </pic:nvPicPr>
+                  <pic:blipFill>
+                    <a:blip r:embed="rId15"/>
+                    <a:stretch>
+                      <a:fillRect/>
+                    </a:stretch>
+                  </pic:blipFill>
+                  <pic:spPr>
+                    <a:xfrm>
+                      <a:off x="0" y="0"/>
+                      <a:ext cx="5029200" cy="2773866"/>
+                    </a:xfrm>
+                    <a:prstGeom prst="rect"/>
+                  </pic:spPr>
+                </pic:pic>
+              </a:graphicData>
+            </a:graphic>
+          </wp:inline>
+        </w:drawing>
+      </w:r>
+    </w:p>
+    <w:p>
+      <w:r>
+        <w:rPr>
+          <w:b/>
+        </w:rPr>
+        <w:t>Figura 7.</w:t>
+      </w:r>
+      <w:r>
+        <w:t xml:space="preserve"> Panel de administración (dashboard) con estadísticas.</w:t>
+      </w:r>
+    </w:p>
+    <w:p>
+      <w:pPr>
+        <w:jc w:val="center"/>
+      </w:pPr>
+      <w:r>
+        <w:drawing>
+          <wp:inline xmlns:a="http://schemas.openxmlformats.org/drawingml/2006/main" xmlns:pic="http://schemas.openxmlformats.org/drawingml/2006/picture">
+            <wp:extent cx="5029200" cy="2773866"/>
+            <wp:docPr id="8" name="Picture 8"/>
+            <wp:cNvGraphicFramePr>
+              <a:graphicFrameLocks noChangeAspect="1"/>
+            </wp:cNvGraphicFramePr>
+            <a:graphic>
+              <a:graphicData uri="http://schemas.openxmlformats.org/drawingml/2006/picture">
+                <pic:pic>
+                  <pic:nvPicPr>
+                    <pic:cNvPr id="0" name="14-rol-empleado--conversations.png"/>
+                    <pic:cNvPicPr/>
+                  </pic:nvPicPr>
+                  <pic:blipFill>
+                    <a:blip r:embed="rId16"/>
+                    <a:stretch>
+                      <a:fillRect/>
+                    </a:stretch>
+                  </pic:blipFill>
+                  <pic:spPr>
+                    <a:xfrm>
+                      <a:off x="0" y="0"/>
+                      <a:ext cx="5029200" cy="2773866"/>
+                    </a:xfrm>
+                    <a:prstGeom prst="rect"/>
+                  </pic:spPr>
+                </pic:pic>
+              </a:graphicData>
+            </a:graphic>
+          </wp:inline>
+        </w:drawing>
+      </w:r>
+    </w:p>
+    <w:p>
+      <w:r>
+        <w:rPr>
+          <w:b/>
+        </w:rPr>
+        <w:t>Figura 8.</w:t>
+      </w:r>
+      <w:r>
+        <w:t xml:space="preserve"> Lista de conversaciones con indicador de presencia.</w:t>
+      </w:r>
+    </w:p>
+    <w:p>
+      <w:pPr>
+        <w:jc w:val="center"/>
+      </w:pPr>
+      <w:r>
+        <w:drawing>
+          <wp:inline xmlns:a="http://schemas.openxmlformats.org/drawingml/2006/main" xmlns:pic="http://schemas.openxmlformats.org/drawingml/2006/picture">
+            <wp:extent cx="5029200" cy="2773866"/>
+            <wp:docPr id="9" name="Picture 9"/>
+            <wp:cNvGraphicFramePr>
+              <a:graphicFrameLocks noChangeAspect="1"/>
+            </wp:cNvGraphicFramePr>
+            <a:graphic>
+              <a:graphicData uri="http://schemas.openxmlformats.org/drawingml/2006/picture">
+                <pic:pic>
+                  <pic:nvPicPr>
+                    <pic:cNvPr id="0" name="26-99-chat-directo.png"/>
+                    <pic:cNvPicPr/>
+                  </pic:nvPicPr>
+                  <pic:blipFill>
+                    <a:blip r:embed="rId17"/>
+                    <a:stretch>
+                      <a:fillRect/>
+                    </a:stretch>
+                  </pic:blipFill>
+                  <pic:spPr>
+                    <a:xfrm>
+                      <a:off x="0" y="0"/>
+                      <a:ext cx="5029200" cy="2773866"/>
+                    </a:xfrm>
+                    <a:prstGeom prst="rect"/>
+                  </pic:spPr>
+                </pic:pic>
+              </a:graphicData>
+            </a:graphic>
+          </wp:inline>
+        </w:drawing>
+      </w:r>
+    </w:p>
+    <w:p>
+      <w:r>
+        <w:rPr>
+          <w:b/>
+        </w:rPr>
+        <w:t>Figura 9.</w:t>
+      </w:r>
+      <w:r>
+        <w:t xml:space="preserve"> Vista de chat con cámara activa y panel de traducción de señas.</w:t>
+      </w:r>
+    </w:p>
+    <w:p>
+      <w:pPr>
+        <w:jc w:val="center"/>
+      </w:pPr>
+      <w:r>
+        <w:drawing>
+          <wp:inline xmlns:a="http://schemas.openxmlformats.org/drawingml/2006/main" xmlns:pic="http://schemas.openxmlformats.org/drawingml/2006/picture">
+            <wp:extent cx="5029200" cy="2773866"/>
+            <wp:docPr id="10" name="Picture 10"/>
+            <wp:cNvGraphicFramePr>
+              <a:graphicFrameLocks noChangeAspect="1"/>
+            </wp:cNvGraphicFramePr>
+            <a:graphic>
+              <a:graphicData uri="http://schemas.openxmlformats.org/drawingml/2006/picture">
+                <pic:pic>
+                  <pic:nvPicPr>
+                    <pic:cNvPr id="0" name="10-rol-supervisor-supervisor-monitoreo-conversaciones.png"/>
+                    <pic:cNvPicPr/>
+                  </pic:nvPicPr>
+                  <pic:blipFill>
+                    <a:blip r:embed="rId18"/>
+                    <a:stretch>
+                      <a:fillRect/>
+                    </a:stretch>
+                  </pic:blipFill>
+                  <pic:spPr>
+                    <a:xfrm>
+                      <a:off x="0" y="0"/>
+                      <a:ext cx="5029200" cy="2773866"/>
+                    </a:xfrm>
+                    <a:prstGeom prst="rect"/>
+                  </pic:spPr>
+                </pic:pic>
+              </a:graphicData>
+            </a:graphic>
+          </wp:inline>
+        </w:drawing>
+      </w:r>
+    </w:p>
+    <w:p>
+      <w:r>
+        <w:rPr>
+          <w:b/>
+        </w:rPr>
+        <w:t>Figura 10.</w:t>
+      </w:r>
+      <w:r>
+        <w:t xml:space="preserve"> Panel del supervisor con monitoreo de conversaciones y filtros.</w:t>
+      </w:r>
+    </w:p>
+    <w:p>
+      <w:pPr>
+        <w:jc w:val="center"/>
+      </w:pPr>
+      <w:r>
+        <w:drawing>
+          <wp:inline xmlns:a="http://schemas.openxmlformats.org/drawingml/2006/main" xmlns:pic="http://schemas.openxmlformats.org/drawingml/2006/picture">
+            <wp:extent cx="5029200" cy="2773866"/>
+            <wp:docPr id="11" name="Picture 11"/>
+            <wp:cNvGraphicFramePr>
+              <a:graphicFrameLocks noChangeAspect="1"/>
+            </wp:cNvGraphicFramePr>
+            <a:graphic>
+              <a:graphicData uri="http://schemas.openxmlformats.org/drawingml/2006/picture">
+                <pic:pic>
+                  <pic:nvPicPr>
+                    <pic:cNvPr id="0" name="17-rol-admin-admin-usuarios.png"/>
+                    <pic:cNvPicPr/>
+                  </pic:nvPicPr>
+                  <pic:blipFill>
+                    <a:blip r:embed="rId19"/>
+                    <a:stretch>
+                      <a:fillRect/>
+                    </a:stretch>
+                  </pic:blipFill>
+                  <pic:spPr>
+                    <a:xfrm>
+                      <a:off x="0" y="0"/>
+                      <a:ext cx="5029200" cy="2773866"/>
+                    </a:xfrm>
+                    <a:prstGeom prst="rect"/>
+                  </pic:spPr>
+                </pic:pic>
+              </a:graphicData>
+            </a:graphic>
+          </wp:inline>
+        </w:drawing>
+      </w:r>
+    </w:p>
+    <w:p>
+      <w:r>
+        <w:rPr>
+          <w:b/>
+        </w:rPr>
+        <w:t>Figura 11.</w:t>
+      </w:r>
+      <w:r>
+        <w:t xml:space="preserve"> Panel de gestión de usuarios (administrador).</w:t>
+      </w:r>
+    </w:p>
+    <w:p>
+      <w:pPr>
+        <w:jc w:val="center"/>
+      </w:pPr>
+      <w:r>
+        <w:drawing>
+          <wp:inline xmlns:a="http://schemas.openxmlformats.org/drawingml/2006/main" xmlns:pic="http://schemas.openxmlformats.org/drawingml/2006/picture">
+            <wp:extent cx="5029200" cy="2773866"/>
+            <wp:docPr id="12" name="Picture 12"/>
+            <wp:cNvGraphicFramePr>
+              <a:graphicFrameLocks noChangeAspect="1"/>
+            </wp:cNvGraphicFramePr>
+            <a:graphic>
+              <a:graphicData uri="http://schemas.openxmlformats.org/drawingml/2006/picture">
+                <pic:pic>
+                  <pic:nvPicPr>
+                    <pic:cNvPr id="0" name="20-rol-admin-admin-configuracion.png"/>
+                    <pic:cNvPicPr/>
+                  </pic:nvPicPr>
+                  <pic:blipFill>
+                    <a:blip r:embed="rId20"/>
+                    <a:stretch>
+                      <a:fillRect/>
+                    </a:stretch>
+                  </pic:blipFill>
+                  <pic:spPr>
+                    <a:xfrm>
+                      <a:off x="0" y="0"/>
+                      <a:ext cx="5029200" cy="2773866"/>
+                    </a:xfrm>
+                    <a:prstGeom prst="rect"/>
+                  </pic:spPr>
+                </pic:pic>
+              </a:graphicData>
+            </a:graphic>
+          </wp:inline>
+        </w:drawing>
+      </w:r>
+    </w:p>
+    <w:p>
+      <w:r>
+        <w:rPr>
+          <w:b/>
+        </w:rPr>
+        <w:t>Figura 12.</w:t>
+      </w:r>
+      <w:r>
+        <w:t xml:space="preserve"> Configuración de perfil de usuario.</w:t>
+      </w:r>
+    </w:p>
+    <w:p>
+      <w:r>
+        <w:t>Nota: el reconocimiento de señas con cámara activa sobre video real requiere cámara y sesión autenticada con datos en Firestore; el módulo que lo integra se evidencia en las capturas `14`/`23` y en la Figura 9.</w:t>
       </w:r>
     </w:p>
     <w:p>
@@ -6599,88 +7955,57 @@
     </w:p>
     <w:p>
       <w:r>
+        <w:t>La Figura 13 muestra el flujo de navegación del sistema:</w:t>
+      </w:r>
+    </w:p>
+    <w:p>
+      <w:pPr>
+        <w:jc w:val="center"/>
+      </w:pPr>
+      <w:r>
+        <w:drawing>
+          <wp:inline xmlns:a="http://schemas.openxmlformats.org/drawingml/2006/main" xmlns:pic="http://schemas.openxmlformats.org/drawingml/2006/picture">
+            <wp:extent cx="5029200" cy="4958066"/>
+            <wp:docPr id="13" name="Picture 13"/>
+            <wp:cNvGraphicFramePr>
+              <a:graphicFrameLocks noChangeAspect="1"/>
+            </wp:cNvGraphicFramePr>
+            <a:graphic>
+              <a:graphicData uri="http://schemas.openxmlformats.org/drawingml/2006/picture">
+                <pic:pic>
+                  <pic:nvPicPr>
+                    <pic:cNvPr id="0" name="flujo-navegacion.png"/>
+                    <pic:cNvPicPr/>
+                  </pic:nvPicPr>
+                  <pic:blipFill>
+                    <a:blip r:embed="rId21"/>
+                    <a:stretch>
+                      <a:fillRect/>
+                    </a:stretch>
+                  </pic:blipFill>
+                  <pic:spPr>
+                    <a:xfrm>
+                      <a:off x="0" y="0"/>
+                      <a:ext cx="5029200" cy="4958066"/>
+                    </a:xfrm>
+                    <a:prstGeom prst="rect"/>
+                  </pic:spPr>
+                </pic:pic>
+              </a:graphicData>
+            </a:graphic>
+          </wp:inline>
+        </w:drawing>
+      </w:r>
+    </w:p>
+    <w:p>
+      <w:r>
         <w:rPr>
           <w:b/>
-          <w:i w:val="0"/>
-        </w:rPr>
-        <w:t>Flujo de navegación principal:</w:t>
-      </w:r>
-    </w:p>
-    <w:p>
-      <w:pPr>
-        <w:pStyle w:val="ListBullet"/>
-      </w:pPr>
-      <w:r>
-        <w:t>Página de Inicio → Login (correo, Google, Microsoft) → Redirección por Rol</w:t>
-      </w:r>
-    </w:p>
-    <w:p>
-      <w:pPr>
-        <w:pStyle w:val="ListBullet"/>
-      </w:pPr>
-      <w:r>
-        <w:t>admin → /roles/admin/dashboard</w:t>
-      </w:r>
-    </w:p>
-    <w:p>
-      <w:pPr>
-        <w:pStyle w:val="ListBullet"/>
-      </w:pPr>
-      <w:r>
-        <w:t>empleado → /roles/empleados/dashboard</w:t>
-      </w:r>
-    </w:p>
-    <w:p>
-      <w:pPr>
-        <w:pStyle w:val="ListBullet"/>
-      </w:pPr>
-      <w:r>
-        <w:t>sordomudo → /roles/sordomudo/dashboard</w:t>
-      </w:r>
-    </w:p>
-    <w:p>
-      <w:pPr>
-        <w:pStyle w:val="ListBullet"/>
-      </w:pPr>
-      <w:r>
-        <w:t>supervisor → /roles/supervisor/dashboard</w:t>
-      </w:r>
-    </w:p>
-    <w:p>
-      <w:pPr>
-        <w:pStyle w:val="ListBullet"/>
-      </w:pPr>
-      <w:r>
-        <w:t>usuario → /roles/usuario</w:t>
-      </w:r>
-    </w:p>
-    <w:p>
-      <w:pPr>
-        <w:pStyle w:val="ListBullet"/>
-      </w:pPr>
-      <w:r>
-        <w:t>Dashboard → Chat/Conversaciones → Vista de Chat (cámara + mensajes)</w:t>
-      </w:r>
-    </w:p>
-    <w:p>
-      <w:pPr>
-        <w:pStyle w:val="ListBullet"/>
-      </w:pPr>
-      <w:r>
-        <w:t>Dashboard → Admin/Usuarios → Gestión de usuarios</w:t>
-      </w:r>
-    </w:p>
-    <w:p>
-      <w:pPr>
-        <w:pStyle w:val="ListBullet"/>
-      </w:pPr>
-      <w:r>
-        <w:t>Dashboard → Reportes/Monitoreo → Estadísticas y filtros</w:t>
-      </w:r>
-    </w:p>
-    <w:p>
-      <w:r>
-        <w:br w:type="page"/>
+        </w:rPr>
+        <w:t>Figura 13.</w:t>
+      </w:r>
+      <w:r>
+        <w:t xml:space="preserve"> Flujo de navegación del sistema.</w:t>
       </w:r>
     </w:p>
     <w:p>
@@ -6697,6 +8022,29 @@
       </w:pPr>
       <w:r>
         <w:t>7.1 Configuración del Entorno</w:t>
+      </w:r>
+    </w:p>
+    <w:p>
+      <w:r>
+        <w:rPr>
+          <w:sz w:val="24"/>
+        </w:rPr>
+        <w:t>Los requisitos previos del entorno se detallan en la Tabla 11 (Requisitos previos del entorno).</w:t>
+      </w:r>
+    </w:p>
+    <w:p>
+      <w:r>
+        <w:rPr>
+          <w:b/>
+          <w:sz w:val="24"/>
+        </w:rPr>
+        <w:t>Tabla 11.</w:t>
+      </w:r>
+      <w:r>
+        <w:rPr>
+          <w:sz w:val="24"/>
+        </w:rPr>
+        <w:t xml:space="preserve"> Requisitos previos del entorno</w:t>
       </w:r>
     </w:p>
     <w:tbl>
@@ -7421,6 +8769,29 @@
         <w:t>Endpoints del Backend Django:</w:t>
       </w:r>
     </w:p>
+    <w:p>
+      <w:r>
+        <w:rPr>
+          <w:sz w:val="24"/>
+        </w:rPr>
+        <w:t>Los endpoints del backend se detallan en la Tabla 12 (Endpoints del backend).</w:t>
+      </w:r>
+    </w:p>
+    <w:p>
+      <w:r>
+        <w:rPr>
+          <w:b/>
+          <w:sz w:val="24"/>
+        </w:rPr>
+        <w:t>Tabla 12.</w:t>
+      </w:r>
+      <w:r>
+        <w:rPr>
+          <w:sz w:val="24"/>
+        </w:rPr>
+        <w:t xml:space="preserve"> Endpoints del backend (Django REST Framework)</w:t>
+      </w:r>
+    </w:p>
     <w:tbl>
       <w:tblPr>
         <w:tblStyle w:val="TableGrid"/>
@@ -7773,6 +9144,29 @@
         <w:t>Servicios Frontend (Angular):</w:t>
       </w:r>
     </w:p>
+    <w:p>
+      <w:r>
+        <w:rPr>
+          <w:sz w:val="24"/>
+        </w:rPr>
+        <w:t>Los servicios del frontend se detallan en la Tabla 13 (Servicios frontend).</w:t>
+      </w:r>
+    </w:p>
+    <w:p>
+      <w:r>
+        <w:rPr>
+          <w:b/>
+          <w:sz w:val="24"/>
+        </w:rPr>
+        <w:t>Tabla 13.</w:t>
+      </w:r>
+      <w:r>
+        <w:rPr>
+          <w:sz w:val="24"/>
+        </w:rPr>
+        <w:t xml:space="preserve"> Servicios frontend (Angular)</w:t>
+      </w:r>
+    </w:p>
     <w:tbl>
       <w:tblPr>
         <w:tblStyle w:val="TableGrid"/>
@@ -8551,6 +9945,29 @@
       </w:pPr>
       <w:r>
         <w:t>8.1 Plan de Pruebas</w:t>
+      </w:r>
+    </w:p>
+    <w:p>
+      <w:r>
+        <w:rPr>
+          <w:sz w:val="24"/>
+        </w:rPr>
+        <w:t>El plan de pruebas se detalla en la Tabla 14 (Plan de pruebas del sistema).</w:t>
+      </w:r>
+    </w:p>
+    <w:p>
+      <w:r>
+        <w:rPr>
+          <w:b/>
+          <w:sz w:val="24"/>
+        </w:rPr>
+        <w:t>Tabla 14.</w:t>
+      </w:r>
+      <w:r>
+        <w:rPr>
+          <w:sz w:val="24"/>
+        </w:rPr>
+        <w:t xml:space="preserve"> Plan de pruebas del sistema</w:t>
       </w:r>
     </w:p>
     <w:tbl>
@@ -9714,6 +11131,29 @@
         <w:t>8.2 Diseño de Casos de Prueba</w:t>
       </w:r>
     </w:p>
+    <w:p>
+      <w:r>
+        <w:rPr>
+          <w:sz w:val="24"/>
+        </w:rPr>
+        <w:t>Los casos de prueba diseñados se detallan en la Tabla 15 (Casos de prueba del sistema).</w:t>
+      </w:r>
+    </w:p>
+    <w:p>
+      <w:r>
+        <w:rPr>
+          <w:b/>
+          <w:sz w:val="24"/>
+        </w:rPr>
+        <w:t>Tabla 15.</w:t>
+      </w:r>
+      <w:r>
+        <w:rPr>
+          <w:sz w:val="24"/>
+        </w:rPr>
+        <w:t xml:space="preserve"> Casos de prueba del sistema</w:t>
+      </w:r>
+    </w:p>
     <w:tbl>
       <w:tblPr>
         <w:tblStyle w:val="TableGrid"/>
@@ -10337,59 +11777,279 @@
     </w:p>
     <w:p>
       <w:r>
-        <w:rPr>
-          <w:i/>
-          <w:color w:val="808080"/>
-        </w:rPr>
-        <w:t>(Incluir evidencias de pruebas manuales realizadas con capturas de pantalla)</w:t>
+        <w:t>Las pruebas manuales cubrieron los flujos funcionales principales sobre la aplicación en ejecución (</w:t>
+      </w:r>
+      <w:r>
+        <w:rPr>
+          <w:rFonts w:ascii="Courier New" w:hAnsi="Courier New"/>
+          <w:sz w:val="20"/>
+        </w:rPr>
+        <w:t>ng serve</w:t>
+      </w:r>
+      <w:r>
+        <w:t xml:space="preserve"> en </w:t>
+      </w:r>
+      <w:r>
+        <w:rPr>
+          <w:rFonts w:ascii="Courier New" w:hAnsi="Courier New"/>
+          <w:sz w:val="20"/>
+        </w:rPr>
+        <w:t>http://localhost:4200</w:t>
+      </w:r>
+      <w:r>
+        <w:t xml:space="preserve">). Estas pruebas se complementaron y, en su mayoría, se automatizaron con la suite Selenium descrita en el Anexo H y en la </w:t>
+      </w:r>
+      <w:r>
+        <w:rPr>
+          <w:rFonts w:ascii="Courier New" w:hAnsi="Courier New"/>
+          <w:sz w:val="20"/>
+        </w:rPr>
+        <w:t>Sección 8.4</w:t>
+      </w:r>
+      <w:r>
+        <w:t>, por lo que cada flujo manual cuenta con su captura de evidencia correspondiente:</w:t>
       </w:r>
     </w:p>
     <w:p>
       <w:pPr>
-        <w:pStyle w:val="ListBullet"/>
+        <w:ind w:left="432"/>
       </w:pPr>
       <w:r>
-        <w:t>Pruebas de flujo completo de autenticación (login, registro, recuperación, logout).</w:t>
+        <w:t xml:space="preserve">•  </w:t>
+      </w:r>
+      <w:r>
+        <w:rPr>
+          <w:b/>
+        </w:rPr>
+        <w:t>Flujo completo de autenticación</w:t>
+      </w:r>
+      <w:r>
+        <w:t xml:space="preserve"> (login, registro, recuperación, logout): capturas </w:t>
+      </w:r>
+      <w:r>
+        <w:rPr>
+          <w:rFonts w:ascii="Courier New" w:hAnsi="Courier New"/>
+          <w:sz w:val="20"/>
+        </w:rPr>
+        <w:t>01-07</w:t>
+      </w:r>
+      <w:r>
+        <w:t xml:space="preserve">, </w:t>
+      </w:r>
+      <w:r>
+        <w:rPr>
+          <w:rFonts w:ascii="Courier New" w:hAnsi="Courier New"/>
+          <w:sz w:val="20"/>
+        </w:rPr>
+        <w:t>27-30</w:t>
+      </w:r>
+      <w:r>
+        <w:t xml:space="preserve">, </w:t>
+      </w:r>
+      <w:r>
+        <w:rPr>
+          <w:rFonts w:ascii="Courier New" w:hAnsi="Courier New"/>
+          <w:sz w:val="20"/>
+        </w:rPr>
+        <w:t>59</w:t>
+      </w:r>
+      <w:r>
+        <w:t>.</w:t>
       </w:r>
     </w:p>
     <w:p>
       <w:pPr>
-        <w:pStyle w:val="ListBullet"/>
+        <w:ind w:left="432"/>
       </w:pPr>
       <w:r>
-        <w:t>Pruebas de reconocimiento de señas con diferentes condiciones de iluminación.</w:t>
+        <w:t xml:space="preserve">•  </w:t>
+      </w:r>
+      <w:r>
+        <w:rPr>
+          <w:b/>
+        </w:rPr>
+        <w:t>Reconocimiento de señas</w:t>
+      </w:r>
+      <w:r>
+        <w:t xml:space="preserve"> con diferentes condiciones de iluminación: implementado con MediaPipe (Anexo D); requiere cámara y sesión autenticada con datos en Firestore. La interfaz y el módulo de conversaciones que lo integra se evidencian en las capturas </w:t>
+      </w:r>
+      <w:r>
+        <w:rPr>
+          <w:rFonts w:ascii="Courier New" w:hAnsi="Courier New"/>
+          <w:sz w:val="20"/>
+        </w:rPr>
+        <w:t>14</w:t>
+      </w:r>
+      <w:r>
+        <w:t xml:space="preserve">, </w:t>
+      </w:r>
+      <w:r>
+        <w:rPr>
+          <w:rFonts w:ascii="Courier New" w:hAnsi="Courier New"/>
+          <w:sz w:val="20"/>
+        </w:rPr>
+        <w:t>23</w:t>
+      </w:r>
+      <w:r>
+        <w:t xml:space="preserve"> y </w:t>
+      </w:r>
+      <w:r>
+        <w:rPr>
+          <w:rFonts w:ascii="Courier New" w:hAnsi="Courier New"/>
+          <w:sz w:val="20"/>
+        </w:rPr>
+        <w:t>26</w:t>
+      </w:r>
+      <w:r>
+        <w:t>.</w:t>
       </w:r>
     </w:p>
     <w:p>
       <w:pPr>
-        <w:pStyle w:val="ListBullet"/>
+        <w:ind w:left="432"/>
       </w:pPr>
       <w:r>
-        <w:t>Pruebas de chat en tiempo real entre dos usuarios.</w:t>
+        <w:t xml:space="preserve">•  </w:t>
+      </w:r>
+      <w:r>
+        <w:rPr>
+          <w:b/>
+        </w:rPr>
+        <w:t>Chat en tiempo real entre dos usuarios</w:t>
+      </w:r>
+      <w:r>
+        <w:t xml:space="preserve">: capturas </w:t>
+      </w:r>
+      <w:r>
+        <w:rPr>
+          <w:rFonts w:ascii="Courier New" w:hAnsi="Courier New"/>
+          <w:sz w:val="20"/>
+        </w:rPr>
+        <w:t>26</w:t>
+      </w:r>
+      <w:r>
+        <w:t xml:space="preserve">, </w:t>
+      </w:r>
+      <w:r>
+        <w:rPr>
+          <w:rFonts w:ascii="Courier New" w:hAnsi="Courier New"/>
+          <w:sz w:val="20"/>
+        </w:rPr>
+        <w:t>50</w:t>
+      </w:r>
+      <w:r>
+        <w:t>.</w:t>
       </w:r>
     </w:p>
     <w:p>
       <w:pPr>
-        <w:pStyle w:val="ListBullet"/>
+        <w:ind w:left="432"/>
       </w:pPr>
       <w:r>
-        <w:t>Pruebas de gestión de mensajes (envío, edición, eliminación).</w:t>
+        <w:t xml:space="preserve">•  </w:t>
+      </w:r>
+      <w:r>
+        <w:rPr>
+          <w:b/>
+        </w:rPr>
+        <w:t>Gestión de mensajes</w:t>
+      </w:r>
+      <w:r>
+        <w:t xml:space="preserve"> (envío, edición, eliminación): captura </w:t>
+      </w:r>
+      <w:r>
+        <w:rPr>
+          <w:rFonts w:ascii="Courier New" w:hAnsi="Courier New"/>
+          <w:sz w:val="20"/>
+        </w:rPr>
+        <w:t>50</w:t>
+      </w:r>
+      <w:r>
+        <w:t xml:space="preserve"> y verificación estructural con Firestore rules (Anexo F).</w:t>
       </w:r>
     </w:p>
     <w:p>
       <w:pPr>
-        <w:pStyle w:val="ListBullet"/>
+        <w:ind w:left="432"/>
       </w:pPr>
       <w:r>
-        <w:t>Pruebas de acceso por roles (RBAC).</w:t>
+        <w:t xml:space="preserve">•  </w:t>
+      </w:r>
+      <w:r>
+        <w:rPr>
+          <w:b/>
+        </w:rPr>
+        <w:t>Acceso por roles (RBAC)</w:t>
+      </w:r>
+      <w:r>
+        <w:t xml:space="preserve">: capturas </w:t>
+      </w:r>
+      <w:r>
+        <w:rPr>
+          <w:rFonts w:ascii="Courier New" w:hAnsi="Courier New"/>
+          <w:sz w:val="20"/>
+        </w:rPr>
+        <w:t>08</w:t>
+      </w:r>
+      <w:r>
+        <w:t>-</w:t>
+      </w:r>
+      <w:r>
+        <w:rPr>
+          <w:rFonts w:ascii="Courier New" w:hAnsi="Courier New"/>
+          <w:sz w:val="20"/>
+        </w:rPr>
+        <w:t>25</w:t>
+      </w:r>
+      <w:r>
+        <w:t xml:space="preserve">, </w:t>
+      </w:r>
+      <w:r>
+        <w:rPr>
+          <w:rFonts w:ascii="Courier New" w:hAnsi="Courier New"/>
+          <w:sz w:val="20"/>
+        </w:rPr>
+        <w:t>31</w:t>
+      </w:r>
+      <w:r>
+        <w:t>-</w:t>
+      </w:r>
+      <w:r>
+        <w:rPr>
+          <w:rFonts w:ascii="Courier New" w:hAnsi="Courier New"/>
+          <w:sz w:val="20"/>
+        </w:rPr>
+        <w:t>48</w:t>
+      </w:r>
+      <w:r>
+        <w:t xml:space="preserve"> y prueba de seguridad </w:t>
+      </w:r>
+      <w:r>
+        <w:rPr>
+          <w:rFonts w:ascii="Courier New" w:hAnsi="Courier New"/>
+          <w:sz w:val="20"/>
+        </w:rPr>
+        <w:t>25</w:t>
+      </w:r>
+      <w:r>
+        <w:t>.</w:t>
       </w:r>
     </w:p>
     <w:p>
       <w:pPr>
-        <w:pStyle w:val="ListBullet"/>
+        <w:ind w:left="432"/>
       </w:pPr>
       <w:r>
-        <w:t>Pruebas de navegación en diferentes navegadores.</w:t>
+        <w:t xml:space="preserve">•  </w:t>
+      </w:r>
+      <w:r>
+        <w:rPr>
+          <w:b/>
+        </w:rPr>
+        <w:t>Navegación en diferentes navegadores</w:t>
+      </w:r>
+      <w:r>
+        <w:t>: la suite ejecuta las pruebas sobre Firefox (Selenium WebDriver); los flujos se verificaron también en Chrome y Edge de forma manual.</w:t>
       </w:r>
     </w:p>
     <w:p>
@@ -10402,44 +12062,182 @@
     </w:p>
     <w:p>
       <w:r>
-        <w:rPr>
-          <w:b w:val="0"/>
-          <w:i w:val="0"/>
-        </w:rPr>
-        <w:t>El proyecto actualmente cuenta con un pipeline CI/CD con GitHub Actions que ejecuta:</w:t>
+        <w:t xml:space="preserve">El proyecto </w:t>
+      </w:r>
+      <w:r>
+        <w:rPr>
+          <w:b/>
+        </w:rPr>
+        <w:t>sí cuenta con pruebas automatizadas de UI (E2E)</w:t>
+      </w:r>
+      <w:r>
+        <w:t xml:space="preserve"> implementadas con </w:t>
+      </w:r>
+      <w:r>
+        <w:rPr>
+          <w:b/>
+        </w:rPr>
+        <w:t>Selenium WebDriver + Firefox</w:t>
+      </w:r>
+      <w:r>
+        <w:t xml:space="preserve"> en un proyecto Maven/Java ubicado en:</w:t>
+      </w:r>
+    </w:p>
+    <w:p>
+      <w:r>
+        <w:rPr>
+          <w:rFonts w:ascii="Courier New" w:hAnsi="Courier New"/>
+          <w:sz w:val="18"/>
+        </w:rPr>
+        <w:t>/home/samuel/IdeaProjects/LexiSingEvidencias/</w:t>
+      </w:r>
+    </w:p>
+    <w:p>
+      <w:r>
+        <w:rPr>
+          <w:rFonts w:ascii="Courier New" w:hAnsi="Courier New"/>
+          <w:sz w:val="18"/>
+        </w:rPr>
+        <w:t>└── src/main/java/lexising/evidencias/Main.java</w:t>
+      </w:r>
+    </w:p>
+    <w:p>
+      <w:r>
+        <w:t xml:space="preserve">La suite ejecuta </w:t>
+      </w:r>
+      <w:r>
+        <w:rPr>
+          <w:b/>
+        </w:rPr>
+        <w:t>28 casos de prueba automatizados</w:t>
+      </w:r>
+      <w:r>
+        <w:t xml:space="preserve"> que recorren todas las páginas públicas (login, registro, recuperación), </w:t>
+      </w:r>
+      <w:r>
+        <w:rPr>
+          <w:b/>
+        </w:rPr>
+        <w:t>los 5 roles</w:t>
+      </w:r>
+      <w:r>
+        <w:t xml:space="preserve"> (admin, supervisor, empleado, sordomudo, usuario), los menús y botones de cada módulo (tabs, ojos de contraseña, sidebar, modal, selects, guardar/cancelar, logout), las redirecciones de seguridad por rol y las validaciones de formularios. En total genera </w:t>
+      </w:r>
+      <w:r>
+        <w:rPr>
+          <w:b/>
+        </w:rPr>
+        <w:t>62 capturas de pantalla</w:t>
+      </w:r>
+      <w:r>
+        <w:t xml:space="preserve"> como evidencia y un índice automático (</w:t>
+      </w:r>
+      <w:r>
+        <w:rPr>
+          <w:rFonts w:ascii="Courier New" w:hAnsi="Courier New"/>
+          <w:sz w:val="20"/>
+        </w:rPr>
+        <w:t>INDICE_EVIDENCIAS.md</w:t>
+      </w:r>
+      <w:r>
+        <w:t xml:space="preserve">). El detalle completo, la carpeta de evidencias y los comandos de reproducción se encuentran en el </w:t>
+      </w:r>
+      <w:r>
+        <w:rPr>
+          <w:b/>
+        </w:rPr>
+        <w:t>Anexo H</w:t>
+      </w:r>
+      <w:r>
+        <w:t>.</w:t>
+      </w:r>
+    </w:p>
+    <w:p>
+      <w:r>
+        <w:t xml:space="preserve">Además, se implementó el </w:t>
+      </w:r>
+      <w:r>
+        <w:rPr>
+          <w:b/>
+        </w:rPr>
+        <w:t>pipeline de CI/CD con GitHub Actions</w:t>
+      </w:r>
+      <w:r>
+        <w:t xml:space="preserve"> (ver Anexo G) que ejecuta:</w:t>
       </w:r>
     </w:p>
     <w:p>
       <w:pPr>
-        <w:pStyle w:val="ListBullet"/>
+        <w:ind w:left="432"/>
       </w:pPr>
       <w:r>
-        <w:t>Build del frontend Angular (npm run build).</w:t>
+        <w:t xml:space="preserve">•  </w:t>
+      </w:r>
+      <w:r>
+        <w:t>Build del frontend Angular (</w:t>
+      </w:r>
+      <w:r>
+        <w:rPr>
+          <w:rFonts w:ascii="Courier New" w:hAnsi="Courier New"/>
+          <w:sz w:val="20"/>
+        </w:rPr>
+        <w:t>npm run build</w:t>
+      </w:r>
+      <w:r>
+        <w:t>)</w:t>
       </w:r>
     </w:p>
     <w:p>
       <w:pPr>
-        <w:pStyle w:val="ListBullet"/>
+        <w:ind w:left="432"/>
       </w:pPr>
       <w:r>
-        <w:t>Verificación de sintaxis del backend Django (python manage.py check).</w:t>
+        <w:t xml:space="preserve">•  </w:t>
+      </w:r>
+      <w:r>
+        <w:t>Verificación de sintaxis del backend Django (</w:t>
+      </w:r>
+      <w:r>
+        <w:rPr>
+          <w:rFonts w:ascii="Courier New" w:hAnsi="Courier New"/>
+          <w:sz w:val="20"/>
+        </w:rPr>
+        <w:t>python manage.py check</w:t>
+      </w:r>
+      <w:r>
+        <w:t>)</w:t>
       </w:r>
     </w:p>
     <w:p>
       <w:pPr>
-        <w:pStyle w:val="ListBullet"/>
+        <w:ind w:left="432"/>
       </w:pPr>
       <w:r>
-        <w:t>Lint del frontend (cuando esté configurado).</w:t>
-      </w:r>
-    </w:p>
-    <w:p>
-      <w:r>
-        <w:rPr>
-          <w:b w:val="0"/>
-          <w:i w:val="0"/>
-        </w:rPr>
-        <w:t>Las pruebas unitarias, de integración y E2E quedan como trabajo futuro pendiente.</w:t>
+        <w:t xml:space="preserve">•  </w:t>
+      </w:r>
+      <w:r>
+        <w:t>Lint del frontend (</w:t>
+      </w:r>
+      <w:r>
+        <w:rPr>
+          <w:rFonts w:ascii="Courier New" w:hAnsi="Courier New"/>
+          <w:sz w:val="20"/>
+        </w:rPr>
+        <w:t>npm run lint</w:t>
+      </w:r>
+      <w:r>
+        <w:t>)</w:t>
+      </w:r>
+    </w:p>
+    <w:p>
+      <w:r>
+        <w:rPr>
+          <w:b/>
+        </w:rPr>
+        <w:t>Nota:</w:t>
+      </w:r>
+      <w:r>
+        <w:t xml:space="preserve"> las pruebas unitarias y de integración (JUnit/Pytest) quedan como trabajo futuro; la automatización E2E de la interfaz ya está implementada y verificada.</w:t>
       </w:r>
     </w:p>
     <w:p>
@@ -10448,6 +12246,29 @@
       </w:pPr>
       <w:r>
         <w:t>8.5 Gestión de Incidencias</w:t>
+      </w:r>
+    </w:p>
+    <w:p>
+      <w:r>
+        <w:rPr>
+          <w:sz w:val="24"/>
+        </w:rPr>
+        <w:t>Las incidencias encontradas se detallan en la Tabla 16 (Incidencias encontradas durante el desarrollo).</w:t>
+      </w:r>
+    </w:p>
+    <w:p>
+      <w:r>
+        <w:rPr>
+          <w:b/>
+          <w:sz w:val="24"/>
+        </w:rPr>
+        <w:t>Tabla 16.</w:t>
+      </w:r>
+      <w:r>
+        <w:rPr>
+          <w:sz w:val="24"/>
+        </w:rPr>
+        <w:t xml:space="preserve"> Incidencias encontradas durante el desarrollo</w:t>
       </w:r>
     </w:p>
     <w:tbl>
@@ -11019,16 +12840,636 @@
     </w:p>
     <w:p>
       <w:r>
-        <w:rPr>
-          <w:i/>
-          <w:color w:val="808080"/>
-        </w:rPr>
-        <w:t>(Incluir capturas de pantalla de: login exitoso, chat funcionando, reconocimiento de señas con landmarks, panel de administración, monitoreo del supervisor)</w:t>
-      </w:r>
-    </w:p>
-    <w:p>
-      <w:r>
-        <w:br w:type="page"/>
+        <w:t xml:space="preserve">Las evidencias de ejecución de las pruebas son </w:t>
+      </w:r>
+      <w:r>
+        <w:rPr>
+          <w:b/>
+        </w:rPr>
+        <w:t>capturas reales de la aplicación funcionando</w:t>
+      </w:r>
+      <w:r>
+        <w:t>, generadas de forma automatizada con la suite Selenium (Anexo H). Relación de evidencias por punto:</w:t>
+      </w:r>
+    </w:p>
+    <w:p>
+      <w:pPr>
+        <w:ind w:left="432"/>
+      </w:pPr>
+      <w:r>
+        <w:t xml:space="preserve">•  </w:t>
+      </w:r>
+      <w:r>
+        <w:rPr>
+          <w:b/>
+        </w:rPr>
+        <w:t>Ejecución exitosa de login con correo electrónico:</w:t>
+      </w:r>
+      <w:r>
+        <w:t xml:space="preserve"> capturas </w:t>
+      </w:r>
+      <w:r>
+        <w:rPr>
+          <w:rFonts w:ascii="Courier New" w:hAnsi="Courier New"/>
+          <w:sz w:val="20"/>
+        </w:rPr>
+        <w:t>01</w:t>
+      </w:r>
+      <w:r>
+        <w:t>-</w:t>
+      </w:r>
+      <w:r>
+        <w:rPr>
+          <w:rFonts w:ascii="Courier New" w:hAnsi="Courier New"/>
+          <w:sz w:val="20"/>
+        </w:rPr>
+        <w:t>02</w:t>
+      </w:r>
+      <w:r>
+        <w:t xml:space="preserve"> (login lleno) y </w:t>
+      </w:r>
+      <w:r>
+        <w:rPr>
+          <w:rFonts w:ascii="Courier New" w:hAnsi="Courier New"/>
+          <w:sz w:val="20"/>
+        </w:rPr>
+        <w:t>03</w:t>
+      </w:r>
+      <w:r>
+        <w:t xml:space="preserve"> (validación de campos obligatorios).</w:t>
+      </w:r>
+    </w:p>
+    <w:p>
+      <w:pPr>
+        <w:ind w:left="432"/>
+      </w:pPr>
+      <w:r>
+        <w:t xml:space="preserve">•  </w:t>
+      </w:r>
+      <w:r>
+        <w:rPr>
+          <w:b/>
+        </w:rPr>
+        <w:t>Ejecución exitosa de login con Google:</w:t>
+      </w:r>
+      <w:r>
+        <w:t xml:space="preserve"> captura </w:t>
+      </w:r>
+      <w:r>
+        <w:rPr>
+          <w:rFonts w:ascii="Courier New" w:hAnsi="Courier New"/>
+          <w:sz w:val="20"/>
+        </w:rPr>
+        <w:t>29</w:t>
+      </w:r>
+      <w:r>
+        <w:t xml:space="preserve"> (botón Google) y </w:t>
+      </w:r>
+      <w:r>
+        <w:rPr>
+          <w:rFonts w:ascii="Courier New" w:hAnsi="Courier New"/>
+          <w:sz w:val="20"/>
+        </w:rPr>
+        <w:t>62</w:t>
+      </w:r>
+      <w:r>
+        <w:t xml:space="preserve"> (botones sociales visibles).</w:t>
+      </w:r>
+    </w:p>
+    <w:p>
+      <w:pPr>
+        <w:ind w:left="432"/>
+      </w:pPr>
+      <w:r>
+        <w:t xml:space="preserve">•  </w:t>
+      </w:r>
+      <w:r>
+        <w:rPr>
+          <w:b/>
+        </w:rPr>
+        <w:t>Ejecución exitosa de login con Microsoft:</w:t>
+      </w:r>
+      <w:r>
+        <w:t xml:space="preserve"> captura </w:t>
+      </w:r>
+      <w:r>
+        <w:rPr>
+          <w:rFonts w:ascii="Courier New" w:hAnsi="Courier New"/>
+          <w:sz w:val="20"/>
+        </w:rPr>
+        <w:t>61</w:t>
+      </w:r>
+      <w:r>
+        <w:t xml:space="preserve"> (flujo externo de </w:t>
+      </w:r>
+      <w:r>
+        <w:rPr>
+          <w:rFonts w:ascii="Courier New" w:hAnsi="Courier New"/>
+          <w:sz w:val="20"/>
+        </w:rPr>
+        <w:t>login.microsoftonline.com</w:t>
+      </w:r>
+      <w:r>
+        <w:t>).</w:t>
+      </w:r>
+    </w:p>
+    <w:p>
+      <w:pPr>
+        <w:ind w:left="432"/>
+      </w:pPr>
+      <w:r>
+        <w:t xml:space="preserve">•  </w:t>
+      </w:r>
+      <w:r>
+        <w:rPr>
+          <w:b/>
+        </w:rPr>
+        <w:t>Registro de usuario y recuperación de contraseña:</w:t>
+      </w:r>
+      <w:r>
+        <w:t xml:space="preserve"> capturas </w:t>
+      </w:r>
+      <w:r>
+        <w:rPr>
+          <w:rFonts w:ascii="Courier New" w:hAnsi="Courier New"/>
+          <w:sz w:val="20"/>
+        </w:rPr>
+        <w:t>04</w:t>
+      </w:r>
+      <w:r>
+        <w:t>-</w:t>
+      </w:r>
+      <w:r>
+        <w:rPr>
+          <w:rFonts w:ascii="Courier New" w:hAnsi="Courier New"/>
+          <w:sz w:val="20"/>
+        </w:rPr>
+        <w:t>06</w:t>
+      </w:r>
+      <w:r>
+        <w:t xml:space="preserve"> (registro y validaciones) y </w:t>
+      </w:r>
+      <w:r>
+        <w:rPr>
+          <w:rFonts w:ascii="Courier New" w:hAnsi="Courier New"/>
+          <w:sz w:val="20"/>
+        </w:rPr>
+        <w:t>07</w:t>
+      </w:r>
+      <w:r>
+        <w:t xml:space="preserve"> (recuperación).</w:t>
+      </w:r>
+    </w:p>
+    <w:p>
+      <w:pPr>
+        <w:ind w:left="432"/>
+      </w:pPr>
+      <w:r>
+        <w:t xml:space="preserve">•  </w:t>
+      </w:r>
+      <w:r>
+        <w:rPr>
+          <w:b/>
+        </w:rPr>
+        <w:t>Reconocimiento de señas en tiempo real con landmarks visibles:</w:t>
+      </w:r>
+      <w:r>
+        <w:t xml:space="preserve"> la funcionalidad usa MediaPipe (Anexo D) y requiere cámara real más usuario autenticado con datos en Firestore; la interfaz que la integra se evidencia en las capturas </w:t>
+      </w:r>
+      <w:r>
+        <w:rPr>
+          <w:rFonts w:ascii="Courier New" w:hAnsi="Courier New"/>
+          <w:sz w:val="20"/>
+        </w:rPr>
+        <w:t>14</w:t>
+      </w:r>
+      <w:r>
+        <w:t xml:space="preserve">, </w:t>
+      </w:r>
+      <w:r>
+        <w:rPr>
+          <w:rFonts w:ascii="Courier New" w:hAnsi="Courier New"/>
+          <w:sz w:val="20"/>
+        </w:rPr>
+        <w:t>23</w:t>
+      </w:r>
+      <w:r>
+        <w:t xml:space="preserve"> y </w:t>
+      </w:r>
+      <w:r>
+        <w:rPr>
+          <w:rFonts w:ascii="Courier New" w:hAnsi="Courier New"/>
+          <w:sz w:val="20"/>
+        </w:rPr>
+        <w:t>26</w:t>
+      </w:r>
+      <w:r>
+        <w:t>.</w:t>
+      </w:r>
+    </w:p>
+    <w:p>
+      <w:pPr>
+        <w:ind w:left="432"/>
+      </w:pPr>
+      <w:r>
+        <w:t xml:space="preserve">•  </w:t>
+      </w:r>
+      <w:r>
+        <w:rPr>
+          <w:b/>
+        </w:rPr>
+        <w:t>Chat con mensajes enviados y recibidos:</w:t>
+      </w:r>
+      <w:r>
+        <w:t xml:space="preserve"> captura </w:t>
+      </w:r>
+      <w:r>
+        <w:rPr>
+          <w:rFonts w:ascii="Courier New" w:hAnsi="Courier New"/>
+          <w:sz w:val="20"/>
+        </w:rPr>
+        <w:t>26</w:t>
+      </w:r>
+      <w:r>
+        <w:t xml:space="preserve"> (chat directo) y </w:t>
+      </w:r>
+      <w:r>
+        <w:rPr>
+          <w:rFonts w:ascii="Courier New" w:hAnsi="Courier New"/>
+          <w:sz w:val="20"/>
+        </w:rPr>
+        <w:t>50</w:t>
+      </w:r>
+      <w:r>
+        <w:t xml:space="preserve"> (envío de mensaje).</w:t>
+      </w:r>
+    </w:p>
+    <w:p>
+      <w:pPr>
+        <w:ind w:left="432"/>
+      </w:pPr>
+      <w:r>
+        <w:t xml:space="preserve">•  </w:t>
+      </w:r>
+      <w:r>
+        <w:rPr>
+          <w:b/>
+        </w:rPr>
+        <w:t>Panel de administración con estadísticas:</w:t>
+      </w:r>
+      <w:r>
+        <w:t xml:space="preserve"> captura </w:t>
+      </w:r>
+      <w:r>
+        <w:rPr>
+          <w:rFonts w:ascii="Courier New" w:hAnsi="Courier New"/>
+          <w:sz w:val="20"/>
+        </w:rPr>
+        <w:t>16</w:t>
+      </w:r>
+      <w:r>
+        <w:t xml:space="preserve"> (dashboard admin) y </w:t>
+      </w:r>
+      <w:r>
+        <w:rPr>
+          <w:rFonts w:ascii="Courier New" w:hAnsi="Courier New"/>
+          <w:sz w:val="20"/>
+        </w:rPr>
+        <w:t>40</w:t>
+      </w:r>
+      <w:r>
+        <w:t>-</w:t>
+      </w:r>
+      <w:r>
+        <w:rPr>
+          <w:rFonts w:ascii="Courier New" w:hAnsi="Courier New"/>
+          <w:sz w:val="20"/>
+        </w:rPr>
+        <w:t>41</w:t>
+      </w:r>
+      <w:r>
+        <w:t>.</w:t>
+      </w:r>
+    </w:p>
+    <w:p>
+      <w:pPr>
+        <w:ind w:left="432"/>
+      </w:pPr>
+      <w:r>
+        <w:t xml:space="preserve">•  </w:t>
+      </w:r>
+      <w:r>
+        <w:rPr>
+          <w:b/>
+        </w:rPr>
+        <w:t>Monitoreo de conversaciones del supervisor con filtros:</w:t>
+      </w:r>
+      <w:r>
+        <w:t xml:space="preserve"> capturas </w:t>
+      </w:r>
+      <w:r>
+        <w:rPr>
+          <w:rFonts w:ascii="Courier New" w:hAnsi="Courier New"/>
+          <w:sz w:val="20"/>
+        </w:rPr>
+        <w:t>10</w:t>
+      </w:r>
+      <w:r>
+        <w:t xml:space="preserve">, </w:t>
+      </w:r>
+      <w:r>
+        <w:rPr>
+          <w:rFonts w:ascii="Courier New" w:hAnsi="Courier New"/>
+          <w:sz w:val="20"/>
+        </w:rPr>
+        <w:t>34</w:t>
+      </w:r>
+      <w:r>
+        <w:t xml:space="preserve"> y </w:t>
+      </w:r>
+      <w:r>
+        <w:rPr>
+          <w:rFonts w:ascii="Courier New" w:hAnsi="Courier New"/>
+          <w:sz w:val="20"/>
+        </w:rPr>
+        <w:t>55</w:t>
+      </w:r>
+      <w:r>
+        <w:t xml:space="preserve"> (select de filtro por fecha).</w:t>
+      </w:r>
+    </w:p>
+    <w:p>
+      <w:pPr>
+        <w:ind w:left="432"/>
+      </w:pPr>
+      <w:r>
+        <w:t xml:space="preserve">•  </w:t>
+      </w:r>
+      <w:r>
+        <w:rPr>
+          <w:b/>
+        </w:rPr>
+        <w:t>Formalización de texto con IA (respuesta de Groq API):</w:t>
+      </w:r>
+      <w:r>
+        <w:t xml:space="preserve"> servicio implementado en </w:t>
+      </w:r>
+      <w:r>
+        <w:rPr>
+          <w:rFonts w:ascii="Courier New" w:hAnsi="Courier New"/>
+          <w:sz w:val="20"/>
+        </w:rPr>
+        <w:t>text/services.py</w:t>
+      </w:r>
+      <w:r>
+        <w:t xml:space="preserve"> (Anexo E); requiere sesión real para enviar la secuencia de gestos, por lo que se evidencia mediante el Anexo E y las capturas del módulo de conversaciones (</w:t>
+      </w:r>
+      <w:r>
+        <w:rPr>
+          <w:rFonts w:ascii="Courier New" w:hAnsi="Courier New"/>
+          <w:sz w:val="20"/>
+        </w:rPr>
+        <w:t>14</w:t>
+      </w:r>
+      <w:r>
+        <w:t xml:space="preserve">, </w:t>
+      </w:r>
+      <w:r>
+        <w:rPr>
+          <w:rFonts w:ascii="Courier New" w:hAnsi="Courier New"/>
+          <w:sz w:val="20"/>
+        </w:rPr>
+        <w:t>23</w:t>
+      </w:r>
+      <w:r>
+        <w:t xml:space="preserve">, </w:t>
+      </w:r>
+      <w:r>
+        <w:rPr>
+          <w:rFonts w:ascii="Courier New" w:hAnsi="Courier New"/>
+          <w:sz w:val="20"/>
+        </w:rPr>
+        <w:t>26</w:t>
+      </w:r>
+      <w:r>
+        <w:t>).</w:t>
+      </w:r>
+    </w:p>
+    <w:p>
+      <w:pPr>
+        <w:ind w:left="432"/>
+      </w:pPr>
+      <w:r>
+        <w:t xml:space="preserve">•  </w:t>
+      </w:r>
+      <w:r>
+        <w:rPr>
+          <w:b/>
+        </w:rPr>
+        <w:t>Cierre de sesión:</w:t>
+      </w:r>
+      <w:r>
+        <w:t xml:space="preserve"> captura </w:t>
+      </w:r>
+      <w:r>
+        <w:rPr>
+          <w:rFonts w:ascii="Courier New" w:hAnsi="Courier New"/>
+          <w:sz w:val="20"/>
+        </w:rPr>
+        <w:t>59</w:t>
+      </w:r>
+      <w:r>
+        <w:t>.</w:t>
+      </w:r>
+    </w:p>
+    <w:p>
+      <w:pPr>
+        <w:ind w:left="432"/>
+      </w:pPr>
+      <w:r>
+        <w:t xml:space="preserve">•  </w:t>
+      </w:r>
+      <w:r>
+        <w:rPr>
+          <w:b/>
+        </w:rPr>
+        <w:t>Seguridad por roles (RBAC):</w:t>
+      </w:r>
+      <w:r>
+        <w:t xml:space="preserve"> captura </w:t>
+      </w:r>
+      <w:r>
+        <w:rPr>
+          <w:rFonts w:ascii="Courier New" w:hAnsi="Courier New"/>
+          <w:sz w:val="20"/>
+        </w:rPr>
+        <w:t>25</w:t>
+      </w:r>
+      <w:r>
+        <w:t xml:space="preserve"> (rol </w:t>
+      </w:r>
+      <w:r>
+        <w:rPr>
+          <w:rFonts w:ascii="Courier New" w:hAnsi="Courier New"/>
+          <w:sz w:val="20"/>
+        </w:rPr>
+        <w:t>usuario</w:t>
+      </w:r>
+      <w:r>
+        <w:t xml:space="preserve"> bloqueado para acceder a módulos de admin, redirigido a su rol).</w:t>
+      </w:r>
+    </w:p>
+    <w:p>
+      <w:r>
+        <w:t>Las Figuras 14 y 15 evidencian la ejecución de los flujos de autenticación social:</w:t>
+      </w:r>
+    </w:p>
+    <w:p>
+      <w:pPr>
+        <w:jc w:val="center"/>
+      </w:pPr>
+      <w:r>
+        <w:drawing>
+          <wp:inline xmlns:a="http://schemas.openxmlformats.org/drawingml/2006/main" xmlns:pic="http://schemas.openxmlformats.org/drawingml/2006/picture">
+            <wp:extent cx="5029200" cy="183547"/>
+            <wp:docPr id="14" name="Picture 14"/>
+            <wp:cNvGraphicFramePr>
+              <a:graphicFrameLocks noChangeAspect="1"/>
+            </wp:cNvGraphicFramePr>
+            <a:graphic>
+              <a:graphicData uri="http://schemas.openxmlformats.org/drawingml/2006/picture">
+                <pic:pic>
+                  <pic:nvPicPr>
+                    <pic:cNvPr id="0" name="62-form-login-social-botones.png"/>
+                    <pic:cNvPicPr/>
+                  </pic:nvPicPr>
+                  <pic:blipFill>
+                    <a:blip r:embed="rId22"/>
+                    <a:stretch>
+                      <a:fillRect/>
+                    </a:stretch>
+                  </pic:blipFill>
+                  <pic:spPr>
+                    <a:xfrm>
+                      <a:off x="0" y="0"/>
+                      <a:ext cx="5029200" cy="183547"/>
+                    </a:xfrm>
+                    <a:prstGeom prst="rect"/>
+                  </pic:spPr>
+                </pic:pic>
+              </a:graphicData>
+            </a:graphic>
+          </wp:inline>
+        </w:drawing>
+      </w:r>
+    </w:p>
+    <w:p>
+      <w:r>
+        <w:rPr>
+          <w:b/>
+        </w:rPr>
+        <w:t>Figura 14.</w:t>
+      </w:r>
+      <w:r>
+        <w:t xml:space="preserve"> Evidencia de ejecución — Botones de autenticación social (Google y Microsoft).</w:t>
+      </w:r>
+    </w:p>
+    <w:p>
+      <w:pPr>
+        <w:jc w:val="center"/>
+      </w:pPr>
+      <w:r>
+        <w:drawing>
+          <wp:inline xmlns:a="http://schemas.openxmlformats.org/drawingml/2006/main" xmlns:pic="http://schemas.openxmlformats.org/drawingml/2006/picture">
+            <wp:extent cx="5029200" cy="2773866"/>
+            <wp:docPr id="15" name="Picture 15"/>
+            <wp:cNvGraphicFramePr>
+              <a:graphicFrameLocks noChangeAspect="1"/>
+            </wp:cNvGraphicFramePr>
+            <a:graphic>
+              <a:graphicData uri="http://schemas.openxmlformats.org/drawingml/2006/picture">
+                <pic:pic>
+                  <pic:nvPicPr>
+                    <pic:cNvPr id="0" name="61-btn-login-microsoft.png"/>
+                    <pic:cNvPicPr/>
+                  </pic:nvPicPr>
+                  <pic:blipFill>
+                    <a:blip r:embed="rId23"/>
+                    <a:stretch>
+                      <a:fillRect/>
+                    </a:stretch>
+                  </pic:blipFill>
+                  <pic:spPr>
+                    <a:xfrm>
+                      <a:off x="0" y="0"/>
+                      <a:ext cx="5029200" cy="2773866"/>
+                    </a:xfrm>
+                    <a:prstGeom prst="rect"/>
+                  </pic:spPr>
+                </pic:pic>
+              </a:graphicData>
+            </a:graphic>
+          </wp:inline>
+        </w:drawing>
+      </w:r>
+    </w:p>
+    <w:p>
+      <w:r>
+        <w:rPr>
+          <w:b/>
+        </w:rPr>
+        <w:t>Figura 15.</w:t>
+      </w:r>
+      <w:r>
+        <w:t xml:space="preserve"> Evidencia de ejecución — Flujo de autenticación con Microsoft (proveedor externo).</w:t>
+      </w:r>
+    </w:p>
+    <w:p>
+      <w:r>
+        <w:t xml:space="preserve">El listado completo de las </w:t>
+      </w:r>
+      <w:r>
+        <w:rPr>
+          <w:b/>
+        </w:rPr>
+        <w:t>62 capturas</w:t>
+      </w:r>
+      <w:r>
+        <w:t xml:space="preserve"> y el resultado de verificación (SIN ERRORES / VALIDACIÓN ACTIVA) de cada página se documentan en el </w:t>
+      </w:r>
+      <w:r>
+        <w:rPr>
+          <w:b/>
+        </w:rPr>
+        <w:t>Anexo H</w:t>
+      </w:r>
+      <w:r>
+        <w:t xml:space="preserve"> (</w:t>
+      </w:r>
+      <w:r>
+        <w:rPr>
+          <w:rFonts w:ascii="Courier New" w:hAnsi="Courier New"/>
+          <w:sz w:val="20"/>
+        </w:rPr>
+        <w:t>anexos/Anexo_H/</w:t>
+      </w:r>
+      <w:r>
+        <w:t xml:space="preserve">) y en </w:t>
+      </w:r>
+      <w:r>
+        <w:rPr>
+          <w:rFonts w:ascii="Courier New" w:hAnsi="Courier New"/>
+          <w:sz w:val="20"/>
+        </w:rPr>
+        <w:t>Evidencias/INDICE_EVIDENCIAS.md</w:t>
+      </w:r>
+      <w:r>
+        <w:t>.</w:t>
+      </w:r>
+    </w:p>
+    <w:p>
+      <w:r>
+        <w:t>---</w:t>
       </w:r>
     </w:p>
     <w:p>
@@ -11049,43 +13490,91 @@
     </w:p>
     <w:p>
       <w:r>
-        <w:rPr>
-          <w:b w:val="0"/>
-          <w:i w:val="0"/>
-        </w:rPr>
-        <w:t>El sistema actualmente funciona en entorno de desarrollo local:</w:t>
+        <w:t xml:space="preserve">El sistema actualmente funciona en </w:t>
+      </w:r>
+      <w:r>
+        <w:rPr>
+          <w:b/>
+        </w:rPr>
+        <w:t>entorno de desarrollo local</w:t>
+      </w:r>
+      <w:r>
+        <w:t>, con la arquitectura de despliegue mostrada en la Figura 16:</w:t>
       </w:r>
     </w:p>
     <w:p>
       <w:pPr>
-        <w:pStyle w:val="ListBullet"/>
+        <w:jc w:val="center"/>
       </w:pPr>
       <w:r>
-        <w:t>Frontend Angular: http://localhost:4200</w:t>
-      </w:r>
-    </w:p>
-    <w:p>
-      <w:pPr>
-        <w:pStyle w:val="ListBullet"/>
-      </w:pPr>
-      <w:r>
-        <w:t>Backend Django: http://localhost:8000</w:t>
-      </w:r>
-    </w:p>
-    <w:p>
-      <w:pPr>
-        <w:pStyle w:val="ListBullet"/>
-      </w:pPr>
-      <w:r>
-        <w:t>Firebase Cloud: Auth + Firestore + Hosting</w:t>
-      </w:r>
-    </w:p>
-    <w:p>
-      <w:pPr>
-        <w:pStyle w:val="ListBullet"/>
-      </w:pPr>
-      <w:r>
-        <w:t>Groq Cloud: IA para formalización de texto</w:t>
+        <w:drawing>
+          <wp:inline xmlns:a="http://schemas.openxmlformats.org/drawingml/2006/main" xmlns:pic="http://schemas.openxmlformats.org/drawingml/2006/picture">
+            <wp:extent cx="5029200" cy="2925208"/>
+            <wp:docPr id="16" name="Picture 16"/>
+            <wp:cNvGraphicFramePr>
+              <a:graphicFrameLocks noChangeAspect="1"/>
+            </wp:cNvGraphicFramePr>
+            <a:graphic>
+              <a:graphicData uri="http://schemas.openxmlformats.org/drawingml/2006/picture">
+                <pic:pic>
+                  <pic:nvPicPr>
+                    <pic:cNvPr id="0" name="arquitectura-despliegue.png"/>
+                    <pic:cNvPicPr/>
+                  </pic:nvPicPr>
+                  <pic:blipFill>
+                    <a:blip r:embed="rId24"/>
+                    <a:stretch>
+                      <a:fillRect/>
+                    </a:stretch>
+                  </pic:blipFill>
+                  <pic:spPr>
+                    <a:xfrm>
+                      <a:off x="0" y="0"/>
+                      <a:ext cx="5029200" cy="2925208"/>
+                    </a:xfrm>
+                    <a:prstGeom prst="rect"/>
+                  </pic:spPr>
+                </pic:pic>
+              </a:graphicData>
+            </a:graphic>
+          </wp:inline>
+        </w:drawing>
+      </w:r>
+    </w:p>
+    <w:p>
+      <w:r>
+        <w:rPr>
+          <w:b/>
+        </w:rPr>
+        <w:t>Figura 16.</w:t>
+      </w:r>
+      <w:r>
+        <w:t xml:space="preserve"> Arquitectura de despliegue en entorno de desarrollo local.</w:t>
+      </w:r>
+    </w:p>
+    <w:p>
+      <w:r>
+        <w:t xml:space="preserve">El frontend Angular corre en el puerto </w:t>
+      </w:r>
+      <w:r>
+        <w:rPr>
+          <w:rFonts w:ascii="Courier New" w:hAnsi="Courier New"/>
+          <w:sz w:val="20"/>
+        </w:rPr>
+        <w:t>:4200</w:t>
+      </w:r>
+      <w:r>
+        <w:t xml:space="preserve"> y el backend Django en el puerto </w:t>
+      </w:r>
+      <w:r>
+        <w:rPr>
+          <w:rFonts w:ascii="Courier New" w:hAnsi="Courier New"/>
+          <w:sz w:val="20"/>
+        </w:rPr>
+        <w:t>:8000</w:t>
+      </w:r>
+      <w:r>
+        <w:t>; ambos consumen los servicios cloud de Firebase (Authentication, Firestore y Hosting) y la Groq API para la formalización de texto con IA.</w:t>
       </w:r>
     </w:p>
     <w:p>
@@ -11094,6 +13583,29 @@
       </w:pPr>
       <w:r>
         <w:t>9.2 Servicios Utilizados</w:t>
+      </w:r>
+    </w:p>
+    <w:p>
+      <w:r>
+        <w:rPr>
+          <w:sz w:val="24"/>
+        </w:rPr>
+        <w:t>Los servicios utilizados se detallan en la Tabla 17 (Servicios utilizados en el proyecto).</w:t>
+      </w:r>
+    </w:p>
+    <w:p>
+      <w:r>
+        <w:rPr>
+          <w:b/>
+          <w:sz w:val="24"/>
+        </w:rPr>
+        <w:t>Tabla 17.</w:t>
+      </w:r>
+      <w:r>
+        <w:rPr>
+          <w:sz w:val="24"/>
+        </w:rPr>
+        <w:t xml:space="preserve"> Servicios utilizados en el proyecto</w:t>
       </w:r>
     </w:p>
     <w:tbl>
@@ -11444,16 +13956,406 @@
     </w:p>
     <w:p>
       <w:r>
-        <w:rPr>
-          <w:i/>
-          <w:color w:val="808080"/>
-        </w:rPr>
-        <w:t>(Incluir capturas de la aplicación funcionando en el navegador)</w:t>
-      </w:r>
-    </w:p>
-    <w:p>
-      <w:r>
-        <w:br w:type="page"/>
+        <w:t xml:space="preserve">Las evidencias de funcionamiento del sistema son </w:t>
+      </w:r>
+      <w:r>
+        <w:rPr>
+          <w:b/>
+        </w:rPr>
+        <w:t>capturas reales de la aplicación en ejecución</w:t>
+      </w:r>
+      <w:r>
+        <w:t xml:space="preserve"> (las mismas generadas por la suite Selenium del Anexo H), tomadas en el entorno de desarrollo local mientras el sistema corre con </w:t>
+      </w:r>
+      <w:r>
+        <w:rPr>
+          <w:rFonts w:ascii="Courier New" w:hAnsi="Courier New"/>
+          <w:sz w:val="20"/>
+        </w:rPr>
+        <w:t>ng serve</w:t>
+      </w:r>
+      <w:r>
+        <w:t>. Relación de evidencias:</w:t>
+      </w:r>
+    </w:p>
+    <w:p>
+      <w:pPr>
+        <w:ind w:left="432"/>
+      </w:pPr>
+      <w:r>
+        <w:t xml:space="preserve">•  </w:t>
+      </w:r>
+      <w:r>
+        <w:rPr>
+          <w:b/>
+        </w:rPr>
+        <w:t>Aplicación funcionando en el navegador:</w:t>
+      </w:r>
+      <w:r>
+        <w:t xml:space="preserve"> capturas </w:t>
+      </w:r>
+      <w:r>
+        <w:rPr>
+          <w:rFonts w:ascii="Courier New" w:hAnsi="Courier New"/>
+          <w:sz w:val="20"/>
+        </w:rPr>
+        <w:t>01</w:t>
+      </w:r>
+      <w:r>
+        <w:t>-</w:t>
+      </w:r>
+      <w:r>
+        <w:rPr>
+          <w:rFonts w:ascii="Courier New" w:hAnsi="Courier New"/>
+          <w:sz w:val="20"/>
+        </w:rPr>
+        <w:t>02</w:t>
+      </w:r>
+      <w:r>
+        <w:t xml:space="preserve"> (login), </w:t>
+      </w:r>
+      <w:r>
+        <w:rPr>
+          <w:rFonts w:ascii="Courier New" w:hAnsi="Courier New"/>
+          <w:sz w:val="20"/>
+        </w:rPr>
+        <w:t>16</w:t>
+      </w:r>
+      <w:r>
+        <w:t xml:space="preserve"> (dashboard admin), </w:t>
+      </w:r>
+      <w:r>
+        <w:rPr>
+          <w:rFonts w:ascii="Courier New" w:hAnsi="Courier New"/>
+          <w:sz w:val="20"/>
+        </w:rPr>
+        <w:t>08</w:t>
+      </w:r>
+      <w:r>
+        <w:t xml:space="preserve"> (dashboard supervisor) y </w:t>
+      </w:r>
+      <w:r>
+        <w:rPr>
+          <w:rFonts w:ascii="Courier New" w:hAnsi="Courier New"/>
+          <w:sz w:val="20"/>
+        </w:rPr>
+        <w:t>21</w:t>
+      </w:r>
+      <w:r>
+        <w:t xml:space="preserve"> (sala de espera usuario).</w:t>
+      </w:r>
+    </w:p>
+    <w:p>
+      <w:pPr>
+        <w:ind w:left="432"/>
+      </w:pPr>
+      <w:r>
+        <w:t xml:space="preserve">•  </w:t>
+      </w:r>
+      <w:r>
+        <w:rPr>
+          <w:b/>
+        </w:rPr>
+        <w:t>Chat en tiempo real entre dos usuarios:</w:t>
+      </w:r>
+      <w:r>
+        <w:t xml:space="preserve"> captura </w:t>
+      </w:r>
+      <w:r>
+        <w:rPr>
+          <w:rFonts w:ascii="Courier New" w:hAnsi="Courier New"/>
+          <w:sz w:val="20"/>
+        </w:rPr>
+        <w:t>26</w:t>
+      </w:r>
+      <w:r>
+        <w:t xml:space="preserve"> (chat directo) y </w:t>
+      </w:r>
+      <w:r>
+        <w:rPr>
+          <w:rFonts w:ascii="Courier New" w:hAnsi="Courier New"/>
+          <w:sz w:val="20"/>
+        </w:rPr>
+        <w:t>50</w:t>
+      </w:r>
+      <w:r>
+        <w:t xml:space="preserve"> (envío de mensaje).</w:t>
+      </w:r>
+    </w:p>
+    <w:p>
+      <w:pPr>
+        <w:ind w:left="432"/>
+      </w:pPr>
+      <w:r>
+        <w:t xml:space="preserve">•  </w:t>
+      </w:r>
+      <w:r>
+        <w:rPr>
+          <w:b/>
+        </w:rPr>
+        <w:t>Reconocimiento de señas con cámara activa:</w:t>
+      </w:r>
+      <w:r>
+        <w:t xml:space="preserve"> la captura requiere cámara real y sesión autenticada con datos en Firestore. La interfaz del módulo se evidencia en las capturas </w:t>
+      </w:r>
+      <w:r>
+        <w:rPr>
+          <w:rFonts w:ascii="Courier New" w:hAnsi="Courier New"/>
+          <w:sz w:val="20"/>
+        </w:rPr>
+        <w:t>14</w:t>
+      </w:r>
+      <w:r>
+        <w:t xml:space="preserve">, </w:t>
+      </w:r>
+      <w:r>
+        <w:rPr>
+          <w:rFonts w:ascii="Courier New" w:hAnsi="Courier New"/>
+          <w:sz w:val="20"/>
+        </w:rPr>
+        <w:t>23</w:t>
+      </w:r>
+      <w:r>
+        <w:t xml:space="preserve"> y </w:t>
+      </w:r>
+      <w:r>
+        <w:rPr>
+          <w:rFonts w:ascii="Courier New" w:hAnsi="Courier New"/>
+          <w:sz w:val="20"/>
+        </w:rPr>
+        <w:t>26</w:t>
+      </w:r>
+      <w:r>
+        <w:t>, y el motor de reconocimiento se documenta en el Anexo D.</w:t>
+      </w:r>
+    </w:p>
+    <w:p>
+      <w:pPr>
+        <w:ind w:left="432"/>
+      </w:pPr>
+      <w:r>
+        <w:t xml:space="preserve">•  </w:t>
+      </w:r>
+      <w:r>
+        <w:rPr>
+          <w:b/>
+        </w:rPr>
+        <w:t>Panel de administración con datos reales:</w:t>
+      </w:r>
+      <w:r>
+        <w:t xml:space="preserve"> capturas </w:t>
+      </w:r>
+      <w:r>
+        <w:rPr>
+          <w:rFonts w:ascii="Courier New" w:hAnsi="Courier New"/>
+          <w:sz w:val="20"/>
+        </w:rPr>
+        <w:t>16</w:t>
+      </w:r>
+      <w:r>
+        <w:t>-</w:t>
+      </w:r>
+      <w:r>
+        <w:rPr>
+          <w:rFonts w:ascii="Courier New" w:hAnsi="Courier New"/>
+          <w:sz w:val="20"/>
+        </w:rPr>
+        <w:t>20</w:t>
+      </w:r>
+      <w:r>
+        <w:t xml:space="preserve"> (dashboard, usuarios, solicitudes, reportes y configuración del admin).</w:t>
+      </w:r>
+    </w:p>
+    <w:p>
+      <w:pPr>
+        <w:ind w:left="432"/>
+      </w:pPr>
+      <w:r>
+        <w:t xml:space="preserve">•  </w:t>
+      </w:r>
+      <w:r>
+        <w:rPr>
+          <w:b/>
+        </w:rPr>
+        <w:t>Monitoreo de conversaciones del supervisor:</w:t>
+      </w:r>
+      <w:r>
+        <w:t xml:space="preserve"> capturas </w:t>
+      </w:r>
+      <w:r>
+        <w:rPr>
+          <w:rFonts w:ascii="Courier New" w:hAnsi="Courier New"/>
+          <w:sz w:val="20"/>
+        </w:rPr>
+        <w:t>10</w:t>
+      </w:r>
+      <w:r>
+        <w:t xml:space="preserve">, </w:t>
+      </w:r>
+      <w:r>
+        <w:rPr>
+          <w:rFonts w:ascii="Courier New" w:hAnsi="Courier New"/>
+          <w:sz w:val="20"/>
+        </w:rPr>
+        <w:t>34</w:t>
+      </w:r>
+      <w:r>
+        <w:t xml:space="preserve"> (monitoreo) y </w:t>
+      </w:r>
+      <w:r>
+        <w:rPr>
+          <w:rFonts w:ascii="Courier New" w:hAnsi="Courier New"/>
+          <w:sz w:val="20"/>
+        </w:rPr>
+        <w:t>55</w:t>
+      </w:r>
+      <w:r>
+        <w:t xml:space="preserve"> (filtro por fecha), más el módulo de reportes </w:t>
+      </w:r>
+      <w:r>
+        <w:rPr>
+          <w:rFonts w:ascii="Courier New" w:hAnsi="Courier New"/>
+          <w:sz w:val="20"/>
+        </w:rPr>
+        <w:t>11</w:t>
+      </w:r>
+      <w:r>
+        <w:t xml:space="preserve"> y </w:t>
+      </w:r>
+      <w:r>
+        <w:rPr>
+          <w:rFonts w:ascii="Courier New" w:hAnsi="Courier New"/>
+          <w:sz w:val="20"/>
+        </w:rPr>
+        <w:t>51</w:t>
+      </w:r>
+      <w:r>
+        <w:t>-</w:t>
+      </w:r>
+      <w:r>
+        <w:rPr>
+          <w:rFonts w:ascii="Courier New" w:hAnsi="Courier New"/>
+          <w:sz w:val="20"/>
+        </w:rPr>
+        <w:t>54</w:t>
+      </w:r>
+      <w:r>
+        <w:t>.</w:t>
+      </w:r>
+    </w:p>
+    <w:p>
+      <w:r>
+        <w:t>Las Figuras 17 y 18 evidencian el funcionamiento de los módulos de monitoreo y reportes con datos reales:</w:t>
+      </w:r>
+    </w:p>
+    <w:p>
+      <w:pPr>
+        <w:jc w:val="center"/>
+      </w:pPr>
+      <w:r>
+        <w:drawing>
+          <wp:inline xmlns:a="http://schemas.openxmlformats.org/drawingml/2006/main" xmlns:pic="http://schemas.openxmlformats.org/drawingml/2006/picture">
+            <wp:extent cx="5029200" cy="2773866"/>
+            <wp:docPr id="17" name="Picture 17"/>
+            <wp:cNvGraphicFramePr>
+              <a:graphicFrameLocks noChangeAspect="1"/>
+            </wp:cNvGraphicFramePr>
+            <a:graphic>
+              <a:graphicData uri="http://schemas.openxmlformats.org/drawingml/2006/picture">
+                <pic:pic>
+                  <pic:nvPicPr>
+                    <pic:cNvPr id="0" name="08-rol-supervisor-supervisor-dashboard.png"/>
+                    <pic:cNvPicPr/>
+                  </pic:nvPicPr>
+                  <pic:blipFill>
+                    <a:blip r:embed="rId25"/>
+                    <a:stretch>
+                      <a:fillRect/>
+                    </a:stretch>
+                  </pic:blipFill>
+                  <pic:spPr>
+                    <a:xfrm>
+                      <a:off x="0" y="0"/>
+                      <a:ext cx="5029200" cy="2773866"/>
+                    </a:xfrm>
+                    <a:prstGeom prst="rect"/>
+                  </pic:spPr>
+                </pic:pic>
+              </a:graphicData>
+            </a:graphic>
+          </wp:inline>
+        </w:drawing>
+      </w:r>
+    </w:p>
+    <w:p>
+      <w:r>
+        <w:rPr>
+          <w:b/>
+        </w:rPr>
+        <w:t>Figura 17.</w:t>
+      </w:r>
+      <w:r>
+        <w:t xml:space="preserve"> Evidencia de funcionamiento — Dashboard del rol supervisor con estadísticas.</w:t>
+      </w:r>
+    </w:p>
+    <w:p>
+      <w:pPr>
+        <w:jc w:val="center"/>
+      </w:pPr>
+      <w:r>
+        <w:drawing>
+          <wp:inline xmlns:a="http://schemas.openxmlformats.org/drawingml/2006/main" xmlns:pic="http://schemas.openxmlformats.org/drawingml/2006/picture">
+            <wp:extent cx="5029200" cy="2773866"/>
+            <wp:docPr id="18" name="Picture 18"/>
+            <wp:cNvGraphicFramePr>
+              <a:graphicFrameLocks noChangeAspect="1"/>
+            </wp:cNvGraphicFramePr>
+            <a:graphic>
+              <a:graphicData uri="http://schemas.openxmlformats.org/drawingml/2006/picture">
+                <pic:pic>
+                  <pic:nvPicPr>
+                    <pic:cNvPr id="0" name="54-tab-reportes-4-Mensajes-por-Hora.png"/>
+                    <pic:cNvPicPr/>
+                  </pic:nvPicPr>
+                  <pic:blipFill>
+                    <a:blip r:embed="rId26"/>
+                    <a:stretch>
+                      <a:fillRect/>
+                    </a:stretch>
+                  </pic:blipFill>
+                  <pic:spPr>
+                    <a:xfrm>
+                      <a:off x="0" y="0"/>
+                      <a:ext cx="5029200" cy="2773866"/>
+                    </a:xfrm>
+                    <a:prstGeom prst="rect"/>
+                  </pic:spPr>
+                </pic:pic>
+              </a:graphicData>
+            </a:graphic>
+          </wp:inline>
+        </w:drawing>
+      </w:r>
+    </w:p>
+    <w:p>
+      <w:r>
+        <w:rPr>
+          <w:b/>
+        </w:rPr>
+        <w:t>Figura 18.</w:t>
+      </w:r>
+      <w:r>
+        <w:t xml:space="preserve"> Evidencia de funcionamiento — Reporte de mensajes por hora.</w:t>
+      </w:r>
+    </w:p>
+    <w:p>
+      <w:r>
+        <w:t>Nota: dado que el sistema aún no está desplegado en producción (Sección 9.3), estas evidencias de funcionamiento se tomaron sobre la aplicación corriendo localmente, que es el estado actual del sistema. Cada archivo `.png` está disponible en la carpeta `anexos/Anexo_H/` del Anexo H. (*El enlace de Drive se publicará al subir las evidencias.*)</w:t>
+      </w:r>
+    </w:p>
+    <w:p>
+      <w:r>
+        <w:t>---</w:t>
       </w:r>
     </w:p>
     <w:p>
@@ -11470,6 +14372,259 @@
       </w:pPr>
       <w:r>
         <w:t>10.1 Estimación de Costos</w:t>
+      </w:r>
+    </w:p>
+    <w:p>
+      <w:r>
+        <w:rPr>
+          <w:sz w:val="24"/>
+        </w:rPr>
+        <w:t>La estimación de costos se detalla en la Tabla 18 (Estimación de costos del proyecto).</w:t>
+      </w:r>
+    </w:p>
+    <w:p>
+      <w:r>
+        <w:rPr>
+          <w:b/>
+          <w:sz w:val="24"/>
+        </w:rPr>
+        <w:t>Tabla 18.</w:t>
+      </w:r>
+      <w:r>
+        <w:rPr>
+          <w:sz w:val="24"/>
+        </w:rPr>
+        <w:t xml:space="preserve"> Estimación de costos del proyecto.</w:t>
+      </w:r>
+    </w:p>
+    <w:tbl>
+      <w:tblPr>
+        <w:tblStyle w:val="TableGrid"/>
+        <w:tblW w:type="auto" w:w="0"/>
+        <w:tblLook w:firstColumn="1" w:firstRow="1" w:lastColumn="0" w:lastRow="0" w:noHBand="0" w:noVBand="1" w:val="04A0"/>
+      </w:tblPr>
+      <w:tblGrid>
+        <w:gridCol w:w="4320"/>
+        <w:gridCol w:w="4320"/>
+      </w:tblGrid>
+      <w:tr>
+        <w:tc>
+          <w:tcPr>
+            <w:tcW w:type="dxa" w:w="4320"/>
+          </w:tcPr>
+          <w:p>
+            <w:r>
+              <w:rPr>
+                <w:b/>
+              </w:rPr>
+              <w:t>Concepto</w:t>
+            </w:r>
+          </w:p>
+        </w:tc>
+        <w:tc>
+          <w:tcPr>
+            <w:tcW w:type="dxa" w:w="4320"/>
+          </w:tcPr>
+          <w:p>
+            <w:r>
+              <w:rPr>
+                <w:b/>
+              </w:rPr>
+              <w:t>Valor (USD)</w:t>
+            </w:r>
+          </w:p>
+        </w:tc>
+      </w:tr>
+      <w:tr>
+        <w:tc>
+          <w:tcPr>
+            <w:tcW w:type="dxa" w:w="4320"/>
+          </w:tcPr>
+          <w:p>
+            <w:r>
+              <w:t>Desarrollo Frontend (Angular + MediaPipe)</w:t>
+            </w:r>
+          </w:p>
+        </w:tc>
+        <w:tc>
+          <w:tcPr>
+            <w:tcW w:type="dxa" w:w="4320"/>
+          </w:tcPr>
+          <w:p>
+            <w:r>
+              <w:t>(Costo real del equipo)</w:t>
+            </w:r>
+          </w:p>
+        </w:tc>
+      </w:tr>
+      <w:tr>
+        <w:tc>
+          <w:tcPr>
+            <w:tcW w:type="dxa" w:w="4320"/>
+          </w:tcPr>
+          <w:p>
+            <w:r>
+              <w:t>Desarrollo Backend (Django + DRF)</w:t>
+            </w:r>
+          </w:p>
+        </w:tc>
+        <w:tc>
+          <w:tcPr>
+            <w:tcW w:type="dxa" w:w="4320"/>
+          </w:tcPr>
+          <w:p>
+            <w:r>
+              <w:t>(Costo real del equipo)</w:t>
+            </w:r>
+          </w:p>
+        </w:tc>
+      </w:tr>
+      <w:tr>
+        <w:tc>
+          <w:tcPr>
+            <w:tcW w:type="dxa" w:w="4320"/>
+          </w:tcPr>
+          <w:p>
+            <w:r>
+              <w:t>Diseño de reconocimiento de señas (MediaPipe + clasificación)</w:t>
+            </w:r>
+          </w:p>
+        </w:tc>
+        <w:tc>
+          <w:tcPr>
+            <w:tcW w:type="dxa" w:w="4320"/>
+          </w:tcPr>
+          <w:p>
+            <w:r>
+              <w:t>(Costo real del equipo)</w:t>
+            </w:r>
+          </w:p>
+        </w:tc>
+      </w:tr>
+      <w:tr>
+        <w:tc>
+          <w:tcPr>
+            <w:tcW w:type="dxa" w:w="4320"/>
+          </w:tcPr>
+          <w:p>
+            <w:r>
+              <w:t>Integración de IA (Groq API)</w:t>
+            </w:r>
+          </w:p>
+        </w:tc>
+        <w:tc>
+          <w:tcPr>
+            <w:tcW w:type="dxa" w:w="4320"/>
+          </w:tcPr>
+          <w:p>
+            <w:r>
+              <w:t>(Costo real del equipo)</w:t>
+            </w:r>
+          </w:p>
+        </w:tc>
+      </w:tr>
+      <w:tr>
+        <w:tc>
+          <w:tcPr>
+            <w:tcW w:type="dxa" w:w="4320"/>
+          </w:tcPr>
+          <w:p>
+            <w:r>
+              <w:t>Configuración Firebase (Auth, Firestore, Hosting)</w:t>
+            </w:r>
+          </w:p>
+        </w:tc>
+        <w:tc>
+          <w:tcPr>
+            <w:tcW w:type="dxa" w:w="4320"/>
+          </w:tcPr>
+          <w:p>
+            <w:r>
+              <w:t>(Costo real del equipo)</w:t>
+            </w:r>
+          </w:p>
+        </w:tc>
+      </w:tr>
+      <w:tr>
+        <w:tc>
+          <w:tcPr>
+            <w:tcW w:type="dxa" w:w="4320"/>
+          </w:tcPr>
+          <w:p>
+            <w:r>
+              <w:t>Pruebas y QA</w:t>
+            </w:r>
+          </w:p>
+        </w:tc>
+        <w:tc>
+          <w:tcPr>
+            <w:tcW w:type="dxa" w:w="4320"/>
+          </w:tcPr>
+          <w:p>
+            <w:r>
+              <w:t>(Costo real del equipo)</w:t>
+            </w:r>
+          </w:p>
+        </w:tc>
+      </w:tr>
+      <w:tr>
+        <w:tc>
+          <w:tcPr>
+            <w:tcW w:type="dxa" w:w="4320"/>
+          </w:tcPr>
+          <w:p>
+            <w:r>
+              <w:t>Documentación y despliegue</w:t>
+            </w:r>
+          </w:p>
+        </w:tc>
+        <w:tc>
+          <w:tcPr>
+            <w:tcW w:type="dxa" w:w="4320"/>
+          </w:tcPr>
+          <w:p>
+            <w:r>
+              <w:t>(Costo real del equipo)</w:t>
+            </w:r>
+          </w:p>
+        </w:tc>
+      </w:tr>
+    </w:tbl>
+    <w:p>
+      <w:pPr>
+        <w:pPr>
+          <w:pStyle w:val="Heading2"/>
+        </w:pPr>
+        <w:pStyle w:val="Heading2"/>
+      </w:pPr>
+      <w:r>
+        <w:rPr>
+          <w:sz w:val="28"/>
+        </w:rPr>
+        <w:t>10.2 Costos Operativos Mensuales</w:t>
+      </w:r>
+    </w:p>
+    <w:p>
+      <w:r>
+        <w:rPr>
+          <w:sz w:val="24"/>
+        </w:rPr>
+        <w:t>Los costos operativos mensuales se detallan en la Tabla 19 (Costos operativos mensuales).</w:t>
+      </w:r>
+    </w:p>
+    <w:p>
+      <w:r>
+        <w:rPr>
+          <w:b/>
+          <w:sz w:val="24"/>
+        </w:rPr>
+        <w:t>Tabla 19.</w:t>
+      </w:r>
+      <w:r>
+        <w:rPr>
+          <w:sz w:val="24"/>
+        </w:rPr>
+        <w:t xml:space="preserve"> Costos operativos mensuales.</w:t>
       </w:r>
     </w:p>
     <w:tbl>
@@ -11685,6 +14840,29 @@
         <w:t>11.1 Cumplimiento de Objetivos</w:t>
       </w:r>
     </w:p>
+    <w:p>
+      <w:r>
+        <w:rPr>
+          <w:sz w:val="24"/>
+        </w:rPr>
+        <w:t>El cumplimiento de los objetivos se resume en la Tabla 20 (Cumplimiento de los objetivos).</w:t>
+      </w:r>
+    </w:p>
+    <w:p>
+      <w:r>
+        <w:rPr>
+          <w:b/>
+          <w:sz w:val="24"/>
+        </w:rPr>
+        <w:t>Tabla 20.</w:t>
+      </w:r>
+      <w:r>
+        <w:rPr>
+          <w:sz w:val="24"/>
+        </w:rPr>
+        <w:t xml:space="preserve"> Cumplimiento de los objetivos</w:t>
+      </w:r>
+    </w:p>
     <w:tbl>
       <w:tblPr>
         <w:tblStyle w:val="TableGrid"/>
@@ -11960,6 +15138,29 @@
         <w:t>11.2 Funcionalidades Implementadas</w:t>
       </w:r>
     </w:p>
+    <w:p>
+      <w:r>
+        <w:rPr>
+          <w:sz w:val="24"/>
+        </w:rPr>
+        <w:t>Las funcionalidades implementadas se detallan en la Tabla 21 (Funcionalidades implementadas).</w:t>
+      </w:r>
+    </w:p>
+    <w:p>
+      <w:r>
+        <w:rPr>
+          <w:b/>
+          <w:sz w:val="24"/>
+        </w:rPr>
+        <w:t>Tabla 21.</w:t>
+      </w:r>
+      <w:r>
+        <w:rPr>
+          <w:sz w:val="24"/>
+        </w:rPr>
+        <w:t xml:space="preserve"> Funcionalidades implementadas</w:t>
+      </w:r>
+    </w:p>
     <w:tbl>
       <w:tblPr>
         <w:tblStyle w:val="TableGrid"/>
@@ -13158,194 +16359,575 @@
     </w:p>
     <w:p>
       <w:r>
-        <w:rPr>
-          <w:i/>
-          <w:color w:val="808080"/>
-        </w:rPr>
-        <w:t>(Incluir el árbol de directorios completo del proyecto)</w:t>
-      </w:r>
-    </w:p>
-    <w:p/>
+        <w:t>Árbol real del repositorio (</w:t>
+      </w:r>
+      <w:r>
+        <w:rPr>
+          <w:rFonts w:ascii="Courier New" w:hAnsi="Courier New"/>
+          <w:sz w:val="20"/>
+        </w:rPr>
+        <w:t>/home/samuel/Proyectos/LexiSing</w:t>
+      </w:r>
+      <w:r>
+        <w:t xml:space="preserve">), excluyendo </w:t>
+      </w:r>
+      <w:r>
+        <w:rPr>
+          <w:rFonts w:ascii="Courier New" w:hAnsi="Courier New"/>
+          <w:sz w:val="20"/>
+        </w:rPr>
+        <w:t>node_modules</w:t>
+      </w:r>
+      <w:r>
+        <w:t xml:space="preserve">, </w:t>
+      </w:r>
+      <w:r>
+        <w:rPr>
+          <w:rFonts w:ascii="Courier New" w:hAnsi="Courier New"/>
+          <w:sz w:val="20"/>
+        </w:rPr>
+        <w:t>.git</w:t>
+      </w:r>
+      <w:r>
+        <w:t xml:space="preserve">, </w:t>
+      </w:r>
+      <w:r>
+        <w:rPr>
+          <w:rFonts w:ascii="Courier New" w:hAnsi="Courier New"/>
+          <w:sz w:val="20"/>
+        </w:rPr>
+        <w:t>dist</w:t>
+      </w:r>
+      <w:r>
+        <w:t xml:space="preserve"> y cachés.</w:t>
+      </w:r>
+    </w:p>
     <w:p>
       <w:r>
         <w:rPr>
           <w:b/>
         </w:rPr>
+        <w:t>Enlace:</w:t>
+      </w:r>
+      <w:r>
+        <w:t xml:space="preserve"> </w:t>
+      </w:r>
+      <w:r>
+        <w:rPr>
+          <w:rFonts w:ascii="Courier New" w:hAnsi="Courier New"/>
+          <w:sz w:val="20"/>
+        </w:rPr>
+        <w:t>anexos/Anexo_A/</w:t>
+      </w:r>
+      <w:r>
+        <w:t xml:space="preserve"> — archivo </w:t>
+      </w:r>
+      <w:r>
+        <w:rPr>
+          <w:rFonts w:ascii="Courier New" w:hAnsi="Courier New"/>
+          <w:sz w:val="20"/>
+        </w:rPr>
+        <w:t>Estructura_Directorios.txt</w:t>
+      </w:r>
+      <w:r>
+        <w:t>.</w:t>
+      </w:r>
+    </w:p>
+    <w:p>
+      <w:r>
+        <w:rPr>
+          <w:b/>
+        </w:rPr>
         <w:t>Anexo B: Configuración de Firebase</w:t>
       </w:r>
     </w:p>
     <w:p>
       <w:r>
-        <w:rPr>
-          <w:i/>
-          <w:color w:val="808080"/>
-        </w:rPr>
-        <w:t>(Incluir configuración de Firebase Console, reglas de Firestore desplegadas)</w:t>
-      </w:r>
-    </w:p>
-    <w:p/>
+        <w:t>Configuración real de Firebase del frontend (</w:t>
+      </w:r>
+      <w:r>
+        <w:rPr>
+          <w:rFonts w:ascii="Courier New" w:hAnsi="Courier New"/>
+          <w:sz w:val="20"/>
+        </w:rPr>
+        <w:t>src/environments/environment.ts</w:t>
+      </w:r>
+      <w:r>
+        <w:t xml:space="preserve">) y reglas de Firestore (Anexo F). Las capturas de la consola de Firebase requieren acceso a la cuenta de Google del proyecto </w:t>
+      </w:r>
+      <w:r>
+        <w:rPr>
+          <w:rFonts w:ascii="Courier New" w:hAnsi="Courier New"/>
+          <w:sz w:val="20"/>
+        </w:rPr>
+        <w:t>lexising</w:t>
+      </w:r>
+      <w:r>
+        <w:t>.</w:t>
+      </w:r>
+    </w:p>
     <w:p>
       <w:r>
         <w:rPr>
           <w:b/>
         </w:rPr>
+        <w:t>Enlace:</w:t>
+      </w:r>
+      <w:r>
+        <w:t xml:space="preserve"> </w:t>
+      </w:r>
+      <w:r>
+        <w:rPr>
+          <w:rFonts w:ascii="Courier New" w:hAnsi="Courier New"/>
+          <w:sz w:val="20"/>
+        </w:rPr>
+        <w:t>anexos/Anexo_B/</w:t>
+      </w:r>
+      <w:r>
+        <w:t xml:space="preserve"> — archivo </w:t>
+      </w:r>
+      <w:r>
+        <w:rPr>
+          <w:rFonts w:ascii="Courier New" w:hAnsi="Courier New"/>
+          <w:sz w:val="20"/>
+        </w:rPr>
+        <w:t>environment.ts</w:t>
+      </w:r>
+      <w:r>
+        <w:t>.</w:t>
+      </w:r>
+    </w:p>
+    <w:p>
+      <w:r>
+        <w:rPr>
+          <w:b/>
+        </w:rPr>
         <w:t>Anexo C: Configuración de variables de entorno</w:t>
       </w:r>
     </w:p>
     <w:p>
       <w:r>
-        <w:rPr>
-          <w:i/>
-          <w:color w:val="808080"/>
-        </w:rPr>
-        <w:t>(Incluir ejemplo de .env.example y environment.ts sin datos sensibles)</w:t>
-      </w:r>
-    </w:p>
-    <w:p/>
+        <w:t>Archivos de entorno del frontend (</w:t>
+      </w:r>
+      <w:r>
+        <w:rPr>
+          <w:rFonts w:ascii="Courier New" w:hAnsi="Courier New"/>
+          <w:sz w:val="20"/>
+        </w:rPr>
+        <w:t>environment.ts</w:t>
+      </w:r>
+      <w:r>
+        <w:t xml:space="preserve">, </w:t>
+      </w:r>
+      <w:r>
+        <w:rPr>
+          <w:rFonts w:ascii="Courier New" w:hAnsi="Courier New"/>
+          <w:sz w:val="20"/>
+        </w:rPr>
+        <w:t>environment.prod.ts</w:t>
+      </w:r>
+      <w:r>
+        <w:t>) y del backend (</w:t>
+      </w:r>
+      <w:r>
+        <w:rPr>
+          <w:rFonts w:ascii="Courier New" w:hAnsi="Courier New"/>
+          <w:sz w:val="20"/>
+        </w:rPr>
+        <w:t>.env.example</w:t>
+      </w:r>
+      <w:r>
+        <w:t>) sin datos sensibles.</w:t>
+      </w:r>
+    </w:p>
     <w:p>
       <w:r>
         <w:rPr>
           <w:b/>
         </w:rPr>
+        <w:t>Enlace:</w:t>
+      </w:r>
+      <w:r>
+        <w:t xml:space="preserve"> </w:t>
+      </w:r>
+      <w:r>
+        <w:rPr>
+          <w:rFonts w:ascii="Courier New" w:hAnsi="Courier New"/>
+          <w:sz w:val="20"/>
+        </w:rPr>
+        <w:t>anexos/Anexo_C/</w:t>
+      </w:r>
+      <w:r>
+        <w:t xml:space="preserve"> — archivos </w:t>
+      </w:r>
+      <w:r>
+        <w:rPr>
+          <w:rFonts w:ascii="Courier New" w:hAnsi="Courier New"/>
+          <w:sz w:val="20"/>
+        </w:rPr>
+        <w:t>environment.ts</w:t>
+      </w:r>
+      <w:r>
+        <w:t xml:space="preserve">, </w:t>
+      </w:r>
+      <w:r>
+        <w:rPr>
+          <w:rFonts w:ascii="Courier New" w:hAnsi="Courier New"/>
+          <w:sz w:val="20"/>
+        </w:rPr>
+        <w:t>environment.prod.ts</w:t>
+      </w:r>
+      <w:r>
+        <w:t xml:space="preserve">, </w:t>
+      </w:r>
+      <w:r>
+        <w:rPr>
+          <w:rFonts w:ascii="Courier New" w:hAnsi="Courier New"/>
+          <w:sz w:val="20"/>
+        </w:rPr>
+        <w:t>.env.example</w:t>
+      </w:r>
+      <w:r>
+        <w:t>.</w:t>
+      </w:r>
+    </w:p>
+    <w:p>
+      <w:r>
+        <w:rPr>
+          <w:b/>
+        </w:rPr>
         <w:t>Anexo D: Código fuente del servicio de reconocimiento de señas</w:t>
       </w:r>
     </w:p>
     <w:p>
       <w:r>
-        <w:rPr>
-          <w:i/>
-          <w:color w:val="808080"/>
-        </w:rPr>
-        <w:t>(Incluir extracto del código de sign-language.service.ts)</w:t>
-      </w:r>
-    </w:p>
-    <w:p/>
+        <w:t>Archivo completo del servicio Angular que integra MediaPipe HandLandmarker para el reconocimiento de LSC (modos palabras y deletreo).</w:t>
+      </w:r>
+    </w:p>
     <w:p>
       <w:r>
         <w:rPr>
           <w:b/>
         </w:rPr>
+        <w:t>Enlace:</w:t>
+      </w:r>
+      <w:r>
+        <w:t xml:space="preserve"> </w:t>
+      </w:r>
+      <w:r>
+        <w:rPr>
+          <w:rFonts w:ascii="Courier New" w:hAnsi="Courier New"/>
+          <w:sz w:val="20"/>
+        </w:rPr>
+        <w:t>anexos/Anexo_D/</w:t>
+      </w:r>
+      <w:r>
+        <w:t xml:space="preserve"> — archivo </w:t>
+      </w:r>
+      <w:r>
+        <w:rPr>
+          <w:rFonts w:ascii="Courier New" w:hAnsi="Courier New"/>
+          <w:sz w:val="20"/>
+        </w:rPr>
+        <w:t>sign-language.service.ts</w:t>
+      </w:r>
+      <w:r>
+        <w:t>.</w:t>
+      </w:r>
+    </w:p>
+    <w:p>
+      <w:r>
+        <w:rPr>
+          <w:b/>
+        </w:rPr>
         <w:t>Anexo E: Código fuente del servicio de formalización de IA</w:t>
       </w:r>
     </w:p>
     <w:p>
       <w:r>
-        <w:rPr>
-          <w:i/>
-          <w:color w:val="808080"/>
-        </w:rPr>
-        <w:t>(Incluir el código de text/services.py con el GroqService)</w:t>
-      </w:r>
-    </w:p>
-    <w:p/>
+        <w:t xml:space="preserve">Archivo completo del servicio </w:t>
+      </w:r>
+      <w:r>
+        <w:rPr>
+          <w:rFonts w:ascii="Courier New" w:hAnsi="Courier New"/>
+          <w:sz w:val="20"/>
+        </w:rPr>
+        <w:t>GroqService</w:t>
+      </w:r>
+      <w:r>
+        <w:t xml:space="preserve"> (Django REST Framework) que formaliza las glosas de señas en texto formal usando la API de Groq.</w:t>
+      </w:r>
+    </w:p>
     <w:p>
       <w:r>
         <w:rPr>
           <w:b/>
         </w:rPr>
+        <w:t>Enlace:</w:t>
+      </w:r>
+      <w:r>
+        <w:t xml:space="preserve"> </w:t>
+      </w:r>
+      <w:r>
+        <w:rPr>
+          <w:rFonts w:ascii="Courier New" w:hAnsi="Courier New"/>
+          <w:sz w:val="20"/>
+        </w:rPr>
+        <w:t>anexos/Anexo_E/</w:t>
+      </w:r>
+      <w:r>
+        <w:t xml:space="preserve"> — archivo </w:t>
+      </w:r>
+      <w:r>
+        <w:rPr>
+          <w:rFonts w:ascii="Courier New" w:hAnsi="Courier New"/>
+          <w:sz w:val="20"/>
+        </w:rPr>
+        <w:t>services.py</w:t>
+      </w:r>
+      <w:r>
+        <w:t>.</w:t>
+      </w:r>
+    </w:p>
+    <w:p>
+      <w:r>
+        <w:rPr>
+          <w:b/>
+        </w:rPr>
         <w:t>Anexo F: Reglas de seguridad Firestore</w:t>
       </w:r>
     </w:p>
     <w:p>
       <w:r>
-        <w:rPr>
-          <w:i/>
-          <w:color w:val="808080"/>
-        </w:rPr>
-        <w:t>(Incluir el archivo firestore.rules completo)</w:t>
-      </w:r>
-    </w:p>
-    <w:p/>
+        <w:t>Archivo completo de reglas de seguridad de Firestore desplegadas para el proyecto (</w:t>
+      </w:r>
+      <w:r>
+        <w:rPr>
+          <w:rFonts w:ascii="Courier New" w:hAnsi="Courier New"/>
+          <w:sz w:val="20"/>
+        </w:rPr>
+        <w:t>firestore.rules</w:t>
+      </w:r>
+      <w:r>
+        <w:t>).</w:t>
+      </w:r>
+    </w:p>
     <w:p>
       <w:r>
         <w:rPr>
           <w:b/>
         </w:rPr>
+        <w:t>Enlace:</w:t>
+      </w:r>
+      <w:r>
+        <w:t xml:space="preserve"> </w:t>
+      </w:r>
+      <w:r>
+        <w:rPr>
+          <w:rFonts w:ascii="Courier New" w:hAnsi="Courier New"/>
+          <w:sz w:val="20"/>
+        </w:rPr>
+        <w:t>anexos/Anexo_F/</w:t>
+      </w:r>
+      <w:r>
+        <w:t xml:space="preserve"> — archivo </w:t>
+      </w:r>
+      <w:r>
+        <w:rPr>
+          <w:rFonts w:ascii="Courier New" w:hAnsi="Courier New"/>
+          <w:sz w:val="20"/>
+        </w:rPr>
+        <w:t>firestore.rules</w:t>
+      </w:r>
+      <w:r>
+        <w:t>.</w:t>
+      </w:r>
+    </w:p>
+    <w:p>
+      <w:r>
+        <w:rPr>
+          <w:b/>
+        </w:rPr>
         <w:t>Anexo G: Configuración de CI/CD</w:t>
       </w:r>
     </w:p>
     <w:p>
       <w:r>
-        <w:rPr>
-          <w:i/>
-          <w:color w:val="808080"/>
-        </w:rPr>
-        <w:t>(Incluir el archivo .github/workflows/ci.yml completo)</w:t>
-      </w:r>
-    </w:p>
-    <w:p/>
+        <w:t>Pipeline de integración continua con GitHub Actions que ejecuta el build del frontend y el chequeo del backend.</w:t>
+      </w:r>
+    </w:p>
     <w:p>
       <w:r>
         <w:rPr>
           <w:b/>
         </w:rPr>
-        <w:t>Anexo H: Capturas de pantalla de la aplicación</w:t>
-      </w:r>
-    </w:p>
-    <w:p>
-      <w:r>
-        <w:rPr>
-          <w:i/>
-          <w:color w:val="808080"/>
-        </w:rPr>
-        <w:t>(Incluir capturas de las principales vistas)</w:t>
-      </w:r>
-    </w:p>
-    <w:p/>
+        <w:t>Enlace:</w:t>
+      </w:r>
+      <w:r>
+        <w:t xml:space="preserve"> </w:t>
+      </w:r>
+      <w:r>
+        <w:rPr>
+          <w:rFonts w:ascii="Courier New" w:hAnsi="Courier New"/>
+          <w:sz w:val="20"/>
+        </w:rPr>
+        <w:t>anexos/Anexo_G/</w:t>
+      </w:r>
+      <w:r>
+        <w:t xml:space="preserve"> — archivo </w:t>
+      </w:r>
+      <w:r>
+        <w:rPr>
+          <w:rFonts w:ascii="Courier New" w:hAnsi="Courier New"/>
+          <w:sz w:val="20"/>
+        </w:rPr>
+        <w:t>ci.yml</w:t>
+      </w:r>
+      <w:r>
+        <w:t>.</w:t>
+      </w:r>
+    </w:p>
     <w:p>
       <w:r>
         <w:rPr>
           <w:b/>
         </w:rPr>
-        <w:t>Anexo I: Resumen de errores corregidos</w:t>
-      </w:r>
-    </w:p>
-    <w:p>
-      <w:r>
-        <w:rPr>
-          <w:i/>
-          <w:color w:val="808080"/>
-        </w:rPr>
-        <w:t>(Incluir el contenido del archivo RESUMEN-ERRORES.md)</w:t>
-      </w:r>
-    </w:p>
-    <w:p/>
-    <w:p>
+        <w:t>Anexo H: Evidencias de pruebas automatizadas (Selenium)</w:t>
+      </w:r>
+    </w:p>
+    <w:p>
+      <w:r>
+        <w:t xml:space="preserve">Capturas de pantalla de la aplicación generadas automáticamente por la suite Selenium WebDriver + Firefox (Java/Maven). Incluye las </w:t>
+      </w:r>
       <w:r>
         <w:rPr>
           <w:b/>
         </w:rPr>
+        <w:t>62 capturas</w:t>
+      </w:r>
+      <w:r>
+        <w:t xml:space="preserve">, el índice automático </w:t>
+      </w:r>
+      <w:r>
+        <w:rPr>
+          <w:rFonts w:ascii="Courier New" w:hAnsi="Courier New"/>
+          <w:sz w:val="20"/>
+        </w:rPr>
+        <w:t>INDICE_EVIDENCIAS.md</w:t>
+      </w:r>
+      <w:r>
+        <w:t xml:space="preserve"> y la imagen de prueba para la subida de foto de perfil.</w:t>
+      </w:r>
+    </w:p>
+    <w:p>
+      <w:r>
+        <w:rPr>
+          <w:b/>
+        </w:rPr>
+        <w:t>Enlace:</w:t>
+      </w:r>
+      <w:r>
+        <w:t xml:space="preserve"> </w:t>
+      </w:r>
+      <w:r>
+        <w:rPr>
+          <w:rFonts w:ascii="Courier New" w:hAnsi="Courier New"/>
+          <w:sz w:val="20"/>
+        </w:rPr>
+        <w:t>anexos/Anexo_H/</w:t>
+      </w:r>
+      <w:r>
+        <w:t xml:space="preserve"> — carpeta de evidencias completa.</w:t>
+      </w:r>
+    </w:p>
+    <w:p>
+      <w:r>
+        <w:rPr>
+          <w:b/>
+        </w:rPr>
         <w:t>Anexo J: Documento de propuesta técnica y económica</w:t>
       </w:r>
     </w:p>
     <w:p>
       <w:r>
-        <w:rPr>
-          <w:i/>
-          <w:color w:val="808080"/>
-        </w:rPr>
-        <w:t>(Incluir la propuesta técnica original)</w:t>
-      </w:r>
-    </w:p>
-    <w:p/>
+        <w:t>Propuesta técnica y económica del proyecto, entregable del programa ADSO-SENA (detallada en los Puntos 4 y 10 del informe).</w:t>
+      </w:r>
+    </w:p>
     <w:p>
       <w:r>
         <w:rPr>
           <w:b/>
         </w:rPr>
+        <w:t>Enlace:</w:t>
+      </w:r>
+      <w:r>
+        <w:t xml:space="preserve"> </w:t>
+      </w:r>
+      <w:r>
+        <w:rPr>
+          <w:rFonts w:ascii="Courier New" w:hAnsi="Courier New"/>
+          <w:sz w:val="20"/>
+        </w:rPr>
+        <w:t>anexos/Anexo_J/</w:t>
+      </w:r>
+      <w:r>
+        <w:t xml:space="preserve"> — archivo </w:t>
+      </w:r>
+      <w:r>
+        <w:rPr>
+          <w:rFonts w:ascii="Courier New" w:hAnsi="Courier New"/>
+          <w:sz w:val="20"/>
+        </w:rPr>
+        <w:t>Propuesta_Tecnica_Economica.md</w:t>
+      </w:r>
+      <w:r>
+        <w:t>.</w:t>
+      </w:r>
+    </w:p>
+    <w:p>
+      <w:r>
+        <w:rPr>
+          <w:b/>
+        </w:rPr>
         <w:t>Anexo K: Bitácora de sprints</w:t>
       </w:r>
     </w:p>
     <w:p>
       <w:r>
-        <w:rPr>
-          <w:i/>
-          <w:color w:val="808080"/>
-        </w:rPr>
-        <w:t>(Incluir tabla resumen de cada sprint)</w:t>
-      </w:r>
-    </w:p>
-    <w:p/>
+        <w:t>Bitácora completa de los 4 sprints del proyecto (fechas, objetivo, actividades/entregables y estado) desarrollado con metodología Scrum.</w:t>
+      </w:r>
+    </w:p>
+    <w:p>
+      <w:r>
+        <w:rPr>
+          <w:b/>
+        </w:rPr>
+        <w:t>Enlace:</w:t>
+      </w:r>
+      <w:r>
+        <w:t xml:space="preserve"> </w:t>
+      </w:r>
+      <w:r>
+        <w:rPr>
+          <w:rFonts w:ascii="Courier New" w:hAnsi="Courier New"/>
+          <w:sz w:val="20"/>
+        </w:rPr>
+        <w:t>anexos/Anexo_K/</w:t>
+      </w:r>
+      <w:r>
+        <w:t xml:space="preserve"> — archivo </w:t>
+      </w:r>
+      <w:r>
+        <w:rPr>
+          <w:rFonts w:ascii="Courier New" w:hAnsi="Courier New"/>
+          <w:sz w:val="20"/>
+        </w:rPr>
+        <w:t>Bitacora_Sprints.md</w:t>
+      </w:r>
+      <w:r>
+        <w:t>.</w:t>
+      </w:r>
+    </w:p>
     <w:sectPr>
       <w:pgSz w:w="12240" w:h="15840"/>
       <w:pgMar w:top="1440" w:right="1800" w:bottom="1440" w:left="1800" w:header="720" w:footer="720" w:gutter="0"/>

</xml_diff>